<commit_message>
Regenerate capability statements and division sites from updated afano_data.py
- 04_Operations-Launch: 6 DOCX regenerated with consolidated BU structure
  (merged overlapping BUs: Tourism+Travel, Workforce+Talent, Mgmt+PMO+OD,
  Community+Foundation, Distribution+Procurement, Software+Data)
- websites/divisions/*/app/page.tsx: 15 scaffolds updated with new BU grids,
  expanded services (30+ additions across all SBGs), merged unit descriptions

Co-Authored-By: Claude Sonnet 4.6 <noreply@anthropic.com>
</commit_message>
<xml_diff>
--- a/04_Operations-Launch/15-SBG-Capability-Statements.docx
+++ b/04_Operations-Launch/15-SBG-Capability-Statements.docx
@@ -71,7 +71,7 @@
           <w:color w:val="555555"/>
           <w:sz w:val="20"/>
         </w:rPr>
-        <w:t>Effective: 2026-06-15  ·  Version 1.0</w:t>
+        <w:t>Effective: 2026-06-16  ·  Version 1.0</w:t>
       </w:r>
     </w:p>
     <w:p>
@@ -187,6 +187,22 @@
       </w:r>
     </w:p>
     <w:p>
+      <w:pPr>
+        <w:pStyle w:val="ListBullet"/>
+      </w:pPr>
+      <w:r>
+        <w:t>Digital Wealth &amp; Robo-Advisory: Algorithm-driven portfolio construction, Goal-based savings</w:t>
+      </w:r>
+    </w:p>
+    <w:p>
+      <w:pPr>
+        <w:pStyle w:val="ListBullet"/>
+      </w:pPr>
+      <w:r>
+        <w:t>Crypto Asset Custody &amp; Digital Asset Trading Desk</w:t>
+      </w:r>
+    </w:p>
+    <w:p>
       <w:r>
         <w:rPr>
           <w:b/>
@@ -221,6 +237,14 @@
       </w:r>
     </w:p>
     <w:p>
+      <w:pPr>
+        <w:pStyle w:val="ListBullet"/>
+      </w:pPr>
+      <w:r>
+        <w:t>Structured Finance: Securitisation, CLOs, Asset-Backed Securities</w:t>
+      </w:r>
+    </w:p>
+    <w:p>
       <w:r>
         <w:rPr>
           <w:b/>
@@ -243,7 +267,23 @@
         <w:pStyle w:val="ListBullet"/>
       </w:pPr>
       <w:r>
-        <w:t>FinTech Solutions: Digital Payments, Mobile Banking, Financial Technology Platforms</w:t>
+        <w:t>FinTech Solutions: Digital Payments, Mobile Banking, Super-App Platforms</w:t>
+      </w:r>
+    </w:p>
+    <w:p>
+      <w:pPr>
+        <w:pStyle w:val="ListBullet"/>
+      </w:pPr>
+      <w:r>
+        <w:t>Open Banking &amp; API Financial Services</w:t>
+      </w:r>
+    </w:p>
+    <w:p>
+      <w:pPr>
+        <w:pStyle w:val="ListBullet"/>
+      </w:pPr>
+      <w:r>
+        <w:t>RegTech: Compliance Automation, AML/KYC Technology</w:t>
       </w:r>
     </w:p>
     <w:p>
@@ -261,7 +301,7 @@
           <w:i w:val="0"/>
           <w:color w:val="0B1F3A"/>
         </w:rPr>
-        <w:t>Banking &amp; Lending (NEW)</w:t>
+        <w:t>Banking &amp; Lending</w:t>
       </w:r>
     </w:p>
     <w:p>
@@ -277,7 +317,7 @@
         <w:pStyle w:val="ListBullet"/>
       </w:pPr>
       <w:r>
-        <w:t>Consumer Banking &amp; Microfinance</w:t>
+        <w:t>Consumer Banking, MSME Lending &amp; Microfinance</w:t>
       </w:r>
     </w:p>
     <w:p>
@@ -286,6 +326,22 @@
       </w:pPr>
       <w:r>
         <w:t>Islamic Finance &amp; Shariah-Compliant Products</w:t>
+      </w:r>
+    </w:p>
+    <w:p>
+      <w:pPr>
+        <w:pStyle w:val="ListBullet"/>
+      </w:pPr>
+      <w:r>
+        <w:t>Digital-Only Banking (Neobank) Operations</w:t>
+      </w:r>
+    </w:p>
+    <w:p>
+      <w:pPr>
+        <w:pStyle w:val="ListBullet"/>
+      </w:pPr>
+      <w:r>
+        <w:t>Mortgage &amp; Real Estate Finance</w:t>
       </w:r>
     </w:p>
     <w:p>
@@ -295,7 +351,7 @@
           <w:i w:val="0"/>
           <w:color w:val="0B1F3A"/>
         </w:rPr>
-        <w:t>Insurance &amp; Reinsurance (NEW)</w:t>
+        <w:t>Insurance &amp; Reinsurance</w:t>
       </w:r>
     </w:p>
     <w:p>
@@ -319,15 +375,23 @@
         <w:pStyle w:val="ListBullet"/>
       </w:pPr>
       <w:r>
-        <w:t>Reinsurance &amp; Captive Insurance Solutions</w:t>
-      </w:r>
-    </w:p>
-    <w:p>
-      <w:pPr>
-        <w:pStyle w:val="ListBullet"/>
-      </w:pPr>
-      <w:r>
-        <w:t>Bancassurance partnerships</w:t>
+        <w:t>Reinsurance, Captive Insurance &amp; Alternative Risk Transfer</w:t>
+      </w:r>
+    </w:p>
+    <w:p>
+      <w:pPr>
+        <w:pStyle w:val="ListBullet"/>
+      </w:pPr>
+      <w:r>
+        <w:t>Bancassurance Partnerships</w:t>
+      </w:r>
+    </w:p>
+    <w:p>
+      <w:pPr>
+        <w:pStyle w:val="ListBullet"/>
+      </w:pPr>
+      <w:r>
+        <w:t>InsurTech: Usage-based &amp; Parametric Insurance Platforms</w:t>
       </w:r>
     </w:p>
     <w:p>
@@ -475,7 +539,7 @@
           <w:i/>
           <w:color w:val="555555"/>
         </w:rPr>
-        <w:t>Renewable generation, power utilities, mining and resource trading.</w:t>
+        <w:t>Renewable generation, power utilities, oil and gas, mining and resource trading.</w:t>
       </w:r>
     </w:p>
     <w:p>
@@ -528,15 +592,39 @@
         <w:pStyle w:val="ListBullet"/>
       </w:pPr>
       <w:r>
-        <w:t>Solar Energy: Installation, Solar Farm Development, Maintenance</w:t>
-      </w:r>
-    </w:p>
-    <w:p>
-      <w:pPr>
-        <w:pStyle w:val="ListBullet"/>
-      </w:pPr>
-      <w:r>
-        <w:t>Renewable Solutions: Wind, Hybrid Systems, Off-Grid</w:t>
+        <w:t>Solar Energy: Utility-Scale PV, Rooftop Solar, Off-Grid Solar</w:t>
+      </w:r>
+    </w:p>
+    <w:p>
+      <w:pPr>
+        <w:pStyle w:val="ListBullet"/>
+      </w:pPr>
+      <w:r>
+        <w:t>Wind &amp; Hybrid Systems: Onshore Wind, Hybrid Solar-Wind, Microgrids</w:t>
+      </w:r>
+    </w:p>
+    <w:p>
+      <w:pPr>
+        <w:pStyle w:val="ListBullet"/>
+      </w:pPr>
+      <w:r>
+        <w:t>Hydrogen &amp; Clean Fuels: Green Hydrogen Production, Fuel Cell Technology</w:t>
+      </w:r>
+    </w:p>
+    <w:p>
+      <w:pPr>
+        <w:pStyle w:val="ListBullet"/>
+      </w:pPr>
+      <w:r>
+        <w:t>Carbon Credits &amp; Emissions Trading: Voluntary Carbon Markets, Offsets</w:t>
+      </w:r>
+    </w:p>
+    <w:p>
+      <w:pPr>
+        <w:pStyle w:val="ListBullet"/>
+      </w:pPr>
+      <w:r>
+        <w:t>Energy Storage: Battery Systems, Grid-Scale Storage Solutions</w:t>
       </w:r>
     </w:p>
     <w:p>
@@ -554,15 +642,31 @@
         <w:pStyle w:val="ListBullet"/>
       </w:pPr>
       <w:r>
-        <w:t>Power Generation: Utility-Scale, Independent Power Production</w:t>
-      </w:r>
-    </w:p>
-    <w:p>
-      <w:pPr>
-        <w:pStyle w:val="ListBullet"/>
-      </w:pPr>
-      <w:r>
-        <w:t>Power Distribution: Grid Infrastructure, Rural Electrification</w:t>
+        <w:t>Power Generation: Utility-Scale, Independent Power Production, Gas Peakers</w:t>
+      </w:r>
+    </w:p>
+    <w:p>
+      <w:pPr>
+        <w:pStyle w:val="ListBullet"/>
+      </w:pPr>
+      <w:r>
+        <w:t>Power Distribution: Grid Infrastructure, Rural Electrification, Smart Metering</w:t>
+      </w:r>
+    </w:p>
+    <w:p>
+      <w:pPr>
+        <w:pStyle w:val="ListBullet"/>
+      </w:pPr>
+      <w:r>
+        <w:t>Water &amp; Sanitation Utilities: Water Treatment, Distribution, Wastewater</w:t>
+      </w:r>
+    </w:p>
+    <w:p>
+      <w:pPr>
+        <w:pStyle w:val="ListBullet"/>
+      </w:pPr>
+      <w:r>
+        <w:t>District Heating &amp; Cooling Systems</w:t>
       </w:r>
     </w:p>
     <w:p>
@@ -588,7 +692,23 @@
         <w:pStyle w:val="ListBullet"/>
       </w:pPr>
       <w:r>
-        <w:t>Resource Development: Mineral Trading, Resource Management</w:t>
+        <w:t>Mineral Trading: Cobalt, Lithium, Gold, Manganese</w:t>
+      </w:r>
+    </w:p>
+    <w:p>
+      <w:pPr>
+        <w:pStyle w:val="ListBullet"/>
+      </w:pPr>
+      <w:r>
+        <w:t>Resource Development: Artisanal Mining Formalisation, Community Mining</w:t>
+      </w:r>
+    </w:p>
+    <w:p>
+      <w:pPr>
+        <w:pStyle w:val="ListBullet"/>
+      </w:pPr>
+      <w:r>
+        <w:t>Critical Minerals for Battery &amp; EV Supply Chains</w:t>
       </w:r>
     </w:p>
     <w:p>
@@ -598,7 +718,7 @@
           <w:i w:val="0"/>
           <w:color w:val="0B1F3A"/>
         </w:rPr>
-        <w:t>Oil, Gas &amp; Petrochemicals (NEW)</w:t>
+        <w:t>Oil, Gas &amp; Petrochemicals</w:t>
       </w:r>
     </w:p>
     <w:p>
@@ -614,7 +734,7 @@
         <w:pStyle w:val="ListBullet"/>
       </w:pPr>
       <w:r>
-        <w:t>Midstream Storage &amp; Transportation</w:t>
+        <w:t>Midstream Storage, Transportation &amp; Pipeline</w:t>
       </w:r>
     </w:p>
     <w:p>
@@ -623,6 +743,14 @@
       </w:pPr>
       <w:r>
         <w:t>Downstream Refining &amp; Petrochemicals</w:t>
+      </w:r>
+    </w:p>
+    <w:p>
+      <w:pPr>
+        <w:pStyle w:val="ListBullet"/>
+      </w:pPr>
+      <w:r>
+        <w:t>LNG Trading &amp; Gas Distribution</w:t>
       </w:r>
     </w:p>
     <w:p>
@@ -863,7 +991,7 @@
         <w:pStyle w:val="ListBullet"/>
       </w:pPr>
       <w:r>
-        <w:t>Live site: https://cybitsolutions.net</w:t>
+        <w:t>OT/ICS Security: Industrial Control Systems Protection</w:t>
       </w:r>
     </w:p>
     <w:p>
@@ -881,15 +1009,15 @@
         <w:pStyle w:val="ListBullet"/>
       </w:pPr>
       <w:r>
-        <w:t>Cloud Services: AWS, Azure, Google Cloud</w:t>
-      </w:r>
-    </w:p>
-    <w:p>
-      <w:pPr>
-        <w:pStyle w:val="ListBullet"/>
-      </w:pPr>
-      <w:r>
-        <w:t>Infrastructure: Data Centers, Networking, Virtualization</w:t>
+        <w:t>Cloud Services: AWS, Azure, Google Cloud Multi-Cloud Management</w:t>
+      </w:r>
+    </w:p>
+    <w:p>
+      <w:pPr>
+        <w:pStyle w:val="ListBullet"/>
+      </w:pPr>
+      <w:r>
+        <w:t>Infrastructure: Data Centers, Colocation, Networking, Virtualization</w:t>
       </w:r>
     </w:p>
     <w:p>
@@ -898,6 +1026,14 @@
       </w:pPr>
       <w:r>
         <w:t>Managed Services: Help Desk, NOC, Infrastructure Support</w:t>
+      </w:r>
+    </w:p>
+    <w:p>
+      <w:pPr>
+        <w:pStyle w:val="ListBullet"/>
+      </w:pPr>
+      <w:r>
+        <w:t>Edge Computing &amp; IoT Platform Services</w:t>
       </w:r>
     </w:p>
     <w:p>
@@ -907,41 +1043,31 @@
           <w:i w:val="0"/>
           <w:color w:val="0B1F3A"/>
         </w:rPr>
-        <w:t>Software Engineering</w:t>
-      </w:r>
-    </w:p>
-    <w:p>
-      <w:pPr>
-        <w:pStyle w:val="ListBullet"/>
-      </w:pPr>
-      <w:r>
-        <w:t>Application Development: Web, Mobile, Enterprise</w:t>
-      </w:r>
-    </w:p>
-    <w:p>
-      <w:pPr>
-        <w:pStyle w:val="ListBullet"/>
-      </w:pPr>
-      <w:r>
-        <w:t>DevSecOps: CI/CD, Automation, Containerization</w:t>
-      </w:r>
-    </w:p>
-    <w:p>
-      <w:r>
-        <w:rPr>
-          <w:b/>
-          <w:i w:val="0"/>
-          <w:color w:val="0B1F3A"/>
-        </w:rPr>
-        <w:t>Data, AI &amp; Automation</w:t>
-      </w:r>
-    </w:p>
-    <w:p>
-      <w:pPr>
-        <w:pStyle w:val="ListBullet"/>
-      </w:pPr>
-      <w:r>
-        <w:t>Data Analytics: BI, Data Warehousing, Dashboards</w:t>
+        <w:t>Software Engineering &amp; Data</w:t>
+      </w:r>
+    </w:p>
+    <w:p>
+      <w:pPr>
+        <w:pStyle w:val="ListBullet"/>
+      </w:pPr>
+      <w:r>
+        <w:t>Application Development: Web, Mobile, Enterprise Platforms</w:t>
+      </w:r>
+    </w:p>
+    <w:p>
+      <w:pPr>
+        <w:pStyle w:val="ListBullet"/>
+      </w:pPr>
+      <w:r>
+        <w:t>DevSecOps: CI/CD, Automation, Containerization, GitOps</w:t>
+      </w:r>
+    </w:p>
+    <w:p>
+      <w:pPr>
+        <w:pStyle w:val="ListBullet"/>
+      </w:pPr>
+      <w:r>
+        <w:t>Data Analytics: BI, Data Warehousing, Lakehouse Architecture</w:t>
       </w:r>
     </w:p>
     <w:p>
@@ -957,7 +1083,7 @@
         <w:pStyle w:val="ListBullet"/>
       </w:pPr>
       <w:r>
-        <w:t>Automation: RPA, Workflow Automation</w:t>
+        <w:t>Automation &amp; RPA: Workflow Automation, Intelligent Process Automation</w:t>
       </w:r>
     </w:p>
     <w:p>
@@ -1003,21 +1129,29 @@
       </w:r>
     </w:p>
     <w:p>
+      <w:pPr>
+        <w:pStyle w:val="ListBullet"/>
+      </w:pPr>
+      <w:r>
+        <w:t>Industry 4.0 Integration: Digital Twin, IIoT, Smart Manufacturing</w:t>
+      </w:r>
+    </w:p>
+    <w:p>
       <w:r>
         <w:rPr>
           <w:b/>
           <w:i w:val="0"/>
           <w:color w:val="0B1F3A"/>
         </w:rPr>
-        <w:t>Telecommunications (NEW)</w:t>
-      </w:r>
-    </w:p>
-    <w:p>
-      <w:pPr>
-        <w:pStyle w:val="ListBullet"/>
-      </w:pPr>
-      <w:r>
-        <w:t>Mobile Network Operations</w:t>
+        <w:t>Telecommunications</w:t>
+      </w:r>
+    </w:p>
+    <w:p>
+      <w:pPr>
+        <w:pStyle w:val="ListBullet"/>
+      </w:pPr>
+      <w:r>
+        <w:t>Mobile Network Operations: 4G/5G MVNO &amp; MNO</w:t>
       </w:r>
     </w:p>
     <w:p>
@@ -1033,7 +1167,7 @@
         <w:pStyle w:val="ListBullet"/>
       </w:pPr>
       <w:r>
-        <w:t>Tower Infrastructure</w:t>
+        <w:t>Tower Infrastructure Development &amp; Management</w:t>
       </w:r>
     </w:p>
     <w:p>
@@ -1049,7 +1183,7 @@
         <w:pStyle w:val="ListBullet"/>
       </w:pPr>
       <w:r>
-        <w:t>Satellite Communications</w:t>
+        <w:t>Satellite Communications &amp; VSAT</w:t>
       </w:r>
     </w:p>
     <w:p>
@@ -1197,7 +1331,7 @@
           <w:i/>
           <w:color w:val="555555"/>
         </w:rPr>
-        <w:t>Architecture, construction, real estate, facility services and logistics infrastructure.</w:t>
+        <w:t>Architecture, construction, real estate, facility services and smart infrastructure.</w:t>
       </w:r>
     </w:p>
     <w:p>
@@ -1242,23 +1376,39 @@
           <w:i w:val="0"/>
           <w:color w:val="0B1F3A"/>
         </w:rPr>
-        <w:t>Architecture &amp; Engineering</w:t>
-      </w:r>
-    </w:p>
-    <w:p>
-      <w:pPr>
-        <w:pStyle w:val="ListBullet"/>
-      </w:pPr>
-      <w:r>
-        <w:t>Architecture: Building Design, Master Planning, Interior Design</w:t>
-      </w:r>
-    </w:p>
-    <w:p>
-      <w:pPr>
-        <w:pStyle w:val="ListBullet"/>
-      </w:pPr>
-      <w:r>
-        <w:t>Engineering: Civil, Structural, MEP</w:t>
+        <w:t>Architecture, Engineering &amp; Design</w:t>
+      </w:r>
+    </w:p>
+    <w:p>
+      <w:pPr>
+        <w:pStyle w:val="ListBullet"/>
+      </w:pPr>
+      <w:r>
+        <w:t>Architecture: Building Design, Master Planning, Interior Design, BIM</w:t>
+      </w:r>
+    </w:p>
+    <w:p>
+      <w:pPr>
+        <w:pStyle w:val="ListBullet"/>
+      </w:pPr>
+      <w:r>
+        <w:t>Engineering: Civil, Structural, MEP, Environmental</w:t>
+      </w:r>
+    </w:p>
+    <w:p>
+      <w:pPr>
+        <w:pStyle w:val="ListBullet"/>
+      </w:pPr>
+      <w:r>
+        <w:t>Urban Planning &amp; Smart City Design</w:t>
+      </w:r>
+    </w:p>
+    <w:p>
+      <w:pPr>
+        <w:pStyle w:val="ListBullet"/>
+      </w:pPr>
+      <w:r>
+        <w:t>Landscape Architecture &amp; Green Infrastructure</w:t>
       </w:r>
     </w:p>
     <w:p>
@@ -1276,23 +1426,31 @@
         <w:pStyle w:val="ListBullet"/>
       </w:pPr>
       <w:r>
-        <w:t>Commercial Construction: Office Buildings, Industrial Facilities</w:t>
-      </w:r>
-    </w:p>
-    <w:p>
-      <w:pPr>
-        <w:pStyle w:val="ListBullet"/>
-      </w:pPr>
-      <w:r>
-        <w:t>Residential Construction: Housing Developments, Luxury Residences</w:t>
-      </w:r>
-    </w:p>
-    <w:p>
-      <w:pPr>
-        <w:pStyle w:val="ListBullet"/>
-      </w:pPr>
-      <w:r>
-        <w:t>Infrastructure Construction: Roads, Bridges, Utilities</w:t>
+        <w:t>Commercial Construction: Office Buildings, Industrial Facilities, Data Centers</w:t>
+      </w:r>
+    </w:p>
+    <w:p>
+      <w:pPr>
+        <w:pStyle w:val="ListBullet"/>
+      </w:pPr>
+      <w:r>
+        <w:t>Residential Construction: Housing Developments, Luxury Residences, Affordable Housing</w:t>
+      </w:r>
+    </w:p>
+    <w:p>
+      <w:pPr>
+        <w:pStyle w:val="ListBullet"/>
+      </w:pPr>
+      <w:r>
+        <w:t>Infrastructure Construction: Roads, Bridges, Ports, Airports, Rail</w:t>
+      </w:r>
+    </w:p>
+    <w:p>
+      <w:pPr>
+        <w:pStyle w:val="ListBullet"/>
+      </w:pPr>
+      <w:r>
+        <w:t>Construction Management &amp; Quantity Surveying</w:t>
       </w:r>
     </w:p>
     <w:p>
@@ -1302,47 +1460,47 @@
           <w:i w:val="0"/>
           <w:color w:val="0B1F3A"/>
         </w:rPr>
-        <w:t>Real Estate</w:t>
-      </w:r>
-    </w:p>
-    <w:p>
-      <w:pPr>
-        <w:pStyle w:val="ListBullet"/>
-      </w:pPr>
-      <w:r>
-        <w:t>Brokerage: Buying, Selling</w:t>
-      </w:r>
-    </w:p>
-    <w:p>
-      <w:pPr>
-        <w:pStyle w:val="ListBullet"/>
-      </w:pPr>
-      <w:r>
-        <w:t>Property Development: Commercial, Residential</w:t>
-      </w:r>
-    </w:p>
-    <w:p>
-      <w:pPr>
-        <w:pStyle w:val="ListBullet"/>
-      </w:pPr>
-      <w:r>
-        <w:t>Property Management: Tenant, Facility</w:t>
-      </w:r>
-    </w:p>
-    <w:p>
-      <w:pPr>
-        <w:pStyle w:val="ListBullet"/>
-      </w:pPr>
-      <w:r>
-        <w:t>Realty Services: Residential &amp; Commercial Sales, Land Sales, Acquisition, Investment Advisory</w:t>
-      </w:r>
-    </w:p>
-    <w:p>
-      <w:pPr>
-        <w:pStyle w:val="ListBullet"/>
-      </w:pPr>
-      <w:r>
-        <w:t>Facility Support: Janitorial, Cleaning, Landscaping, Building Maintenance</w:t>
+        <w:t>Real Estate &amp; Facility Management</w:t>
+      </w:r>
+    </w:p>
+    <w:p>
+      <w:pPr>
+        <w:pStyle w:val="ListBullet"/>
+      </w:pPr>
+      <w:r>
+        <w:t>Property Development: Commercial, Residential, Mixed-Use</w:t>
+      </w:r>
+    </w:p>
+    <w:p>
+      <w:pPr>
+        <w:pStyle w:val="ListBullet"/>
+      </w:pPr>
+      <w:r>
+        <w:t>Brokerage: Buying, Selling, Leasing Advisory</w:t>
+      </w:r>
+    </w:p>
+    <w:p>
+      <w:pPr>
+        <w:pStyle w:val="ListBullet"/>
+      </w:pPr>
+      <w:r>
+        <w:t>Property Management: Tenant Relations, Facility Management</w:t>
+      </w:r>
+    </w:p>
+    <w:p>
+      <w:pPr>
+        <w:pStyle w:val="ListBullet"/>
+      </w:pPr>
+      <w:r>
+        <w:t>Facility Support: Janitorial, Landscaping, Building Maintenance, Energy Management</w:t>
+      </w:r>
+    </w:p>
+    <w:p>
+      <w:pPr>
+        <w:pStyle w:val="ListBullet"/>
+      </w:pPr>
+      <w:r>
+        <w:t>PropTech: Digital Property Platforms, Virtual Tours, AI Valuation</w:t>
       </w:r>
     </w:p>
     <w:p>
@@ -1352,23 +1510,39 @@
           <w:i w:val="0"/>
           <w:color w:val="0B1F3A"/>
         </w:rPr>
-        <w:t>Logistics &amp; Supply Chain</w:t>
-      </w:r>
-    </w:p>
-    <w:p>
-      <w:pPr>
-        <w:pStyle w:val="ListBullet"/>
-      </w:pPr>
-      <w:r>
-        <w:t>Logistics: Transportation, Freight</w:t>
-      </w:r>
-    </w:p>
-    <w:p>
-      <w:pPr>
-        <w:pStyle w:val="ListBullet"/>
-      </w:pPr>
-      <w:r>
-        <w:t>Warehousing: Distribution Centers, Inventory Management</w:t>
+        <w:t>Logistics Infrastructure</w:t>
+      </w:r>
+    </w:p>
+    <w:p>
+      <w:pPr>
+        <w:pStyle w:val="ListBullet"/>
+      </w:pPr>
+      <w:r>
+        <w:t>Warehousing: Distribution Centers, Bonded Warehouses, Cold Chain</w:t>
+      </w:r>
+    </w:p>
+    <w:p>
+      <w:pPr>
+        <w:pStyle w:val="ListBullet"/>
+      </w:pPr>
+      <w:r>
+        <w:t>Port &amp; Terminal Logistics Infrastructure</w:t>
+      </w:r>
+    </w:p>
+    <w:p>
+      <w:pPr>
+        <w:pStyle w:val="ListBullet"/>
+      </w:pPr>
+      <w:r>
+        <w:t>Industrial Parks &amp; Free Zone Development</w:t>
+      </w:r>
+    </w:p>
+    <w:p>
+      <w:pPr>
+        <w:pStyle w:val="ListBullet"/>
+      </w:pPr>
+      <w:r>
+        <w:t>Last-Mile Delivery Network Infrastructure</w:t>
       </w:r>
     </w:p>
     <w:p>
@@ -1516,7 +1690,7 @@
           <w:i/>
           <w:color w:val="555555"/>
         </w:rPr>
-        <w:t>Production, processing, agritech and environmental services.</w:t>
+        <w:t>Production, processing, agritech, food manufacturing and environmental services.</w:t>
       </w:r>
     </w:p>
     <w:p>
@@ -1569,23 +1743,39 @@
         <w:pStyle w:val="ListBullet"/>
       </w:pPr>
       <w:r>
-        <w:t>Crop Farming: Staple Crops, Cash Crops, Greenhouse</w:t>
-      </w:r>
-    </w:p>
-    <w:p>
-      <w:pPr>
-        <w:pStyle w:val="ListBullet"/>
-      </w:pPr>
-      <w:r>
-        <w:t>Livestock: Poultry, Cattle, Dairy</w:t>
-      </w:r>
-    </w:p>
-    <w:p>
-      <w:pPr>
-        <w:pStyle w:val="ListBullet"/>
-      </w:pPr>
-      <w:r>
-        <w:t>Aquaculture: Fish Farming, Aquatic Processing</w:t>
+        <w:t>Crop Farming: Staple Crops, Cash Crops, Greenhouse &amp; Controlled-Environment</w:t>
+      </w:r>
+    </w:p>
+    <w:p>
+      <w:pPr>
+        <w:pStyle w:val="ListBullet"/>
+      </w:pPr>
+      <w:r>
+        <w:t>Livestock: Poultry, Cattle, Dairy &amp; Feedlot Operations</w:t>
+      </w:r>
+    </w:p>
+    <w:p>
+      <w:pPr>
+        <w:pStyle w:val="ListBullet"/>
+      </w:pPr>
+      <w:r>
+        <w:t>Aquaculture: Fish Farming, Shrimp, Aquatic Processing</w:t>
+      </w:r>
+    </w:p>
+    <w:p>
+      <w:pPr>
+        <w:pStyle w:val="ListBullet"/>
+      </w:pPr>
+      <w:r>
+        <w:t>Precision Agriculture &amp; AgriTech: Drone Spraying, IoT Sensors, GPS Farming</w:t>
+      </w:r>
+    </w:p>
+    <w:p>
+      <w:pPr>
+        <w:pStyle w:val="ListBullet"/>
+      </w:pPr>
+      <w:r>
+        <w:t>Irrigation &amp; Water Management: Drip Systems, Borehole Drilling, Dam Management</w:t>
       </w:r>
     </w:p>
     <w:p>
@@ -1595,23 +1785,39 @@
           <w:i w:val="0"/>
           <w:color w:val="0B1F3A"/>
         </w:rPr>
-        <w:t>Agribusiness</w:t>
-      </w:r>
-    </w:p>
-    <w:p>
-      <w:pPr>
-        <w:pStyle w:val="ListBullet"/>
-      </w:pPr>
-      <w:r>
-        <w:t>Agricultural Consulting: Farm Management, Agritech Solutions</w:t>
-      </w:r>
-    </w:p>
-    <w:p>
-      <w:pPr>
-        <w:pStyle w:val="ListBullet"/>
-      </w:pPr>
-      <w:r>
-        <w:t>Commodity Trading: Cocoa, Agricultural Exports</w:t>
+        <w:t>Agribusiness &amp; Commodity Trading</w:t>
+      </w:r>
+    </w:p>
+    <w:p>
+      <w:pPr>
+        <w:pStyle w:val="ListBullet"/>
+      </w:pPr>
+      <w:r>
+        <w:t>Agricultural Consulting: Farm Management, Extension Services, Agritech Solutions</w:t>
+      </w:r>
+    </w:p>
+    <w:p>
+      <w:pPr>
+        <w:pStyle w:val="ListBullet"/>
+      </w:pPr>
+      <w:r>
+        <w:t>Commodity Trading: Cocoa, Coffee, Sesame, Cashew, Soybeans, Agricultural Exports</w:t>
+      </w:r>
+    </w:p>
+    <w:p>
+      <w:pPr>
+        <w:pStyle w:val="ListBullet"/>
+      </w:pPr>
+      <w:r>
+        <w:t>Warehouse Receipt Systems &amp; Commodity Collateral Management</w:t>
+      </w:r>
+    </w:p>
+    <w:p>
+      <w:pPr>
+        <w:pStyle w:val="ListBullet"/>
+      </w:pPr>
+      <w:r>
+        <w:t>Cold Chain Logistics for Agricultural Produce</w:t>
       </w:r>
     </w:p>
     <w:p>
@@ -1621,31 +1827,39 @@
           <w:i w:val="0"/>
           <w:color w:val="0B1F3A"/>
         </w:rPr>
-        <w:t>Food Processing</w:t>
-      </w:r>
-    </w:p>
-    <w:p>
-      <w:pPr>
-        <w:pStyle w:val="ListBullet"/>
-      </w:pPr>
-      <w:r>
-        <w:t>Food Manufacturing: Beverages, Packaged Foods</w:t>
-      </w:r>
-    </w:p>
-    <w:p>
-      <w:pPr>
-        <w:pStyle w:val="ListBullet"/>
-      </w:pPr>
-      <w:r>
-        <w:t>Storage Services: Cold Storage, Commodity Storage</w:t>
-      </w:r>
-    </w:p>
-    <w:p>
-      <w:pPr>
-        <w:pStyle w:val="ListBullet"/>
-      </w:pPr>
-      <w:r>
-        <w:t>Consumer Products: Cocoa Products, Beverages, Mineral Drinks, Packaged Consumer Goods</w:t>
+        <w:t>Food Processing &amp; Consumer Products</w:t>
+      </w:r>
+    </w:p>
+    <w:p>
+      <w:pPr>
+        <w:pStyle w:val="ListBullet"/>
+      </w:pPr>
+      <w:r>
+        <w:t>Food Manufacturing: Beverages, Packaged Foods, Dairy Processing</w:t>
+      </w:r>
+    </w:p>
+    <w:p>
+      <w:pPr>
+        <w:pStyle w:val="ListBullet"/>
+      </w:pPr>
+      <w:r>
+        <w:t>Storage Services: Cold Storage, Silos, Commodity Storage</w:t>
+      </w:r>
+    </w:p>
+    <w:p>
+      <w:pPr>
+        <w:pStyle w:val="ListBullet"/>
+      </w:pPr>
+      <w:r>
+        <w:t>Consumer Products: Cocoa Products, Beverages, Mineral Water, Packaged Goods</w:t>
+      </w:r>
+    </w:p>
+    <w:p>
+      <w:pPr>
+        <w:pStyle w:val="ListBullet"/>
+      </w:pPr>
+      <w:r>
+        <w:t>Private Label &amp; Co-Manufacturing Services</w:t>
       </w:r>
     </w:p>
     <w:p>
@@ -1655,7 +1869,7 @@
           <w:i w:val="0"/>
           <w:color w:val="0B1F3A"/>
         </w:rPr>
-        <w:t>Environmental &amp; Recycling Solutions</w:t>
+        <w:t>Environmental &amp; Circular Economy</w:t>
       </w:r>
     </w:p>
     <w:p>
@@ -1671,7 +1885,23 @@
         <w:pStyle w:val="ListBullet"/>
       </w:pPr>
       <w:r>
-        <w:t>Circular Economy Programs</w:t>
+        <w:t>Circular Economy Programs: Upcycling, Waste-to-Energy</w:t>
+      </w:r>
+    </w:p>
+    <w:p>
+      <w:pPr>
+        <w:pStyle w:val="ListBullet"/>
+      </w:pPr>
+      <w:r>
+        <w:t>Afforestation &amp; Carbon Sequestration Projects</w:t>
+      </w:r>
+    </w:p>
+    <w:p>
+      <w:pPr>
+        <w:pStyle w:val="ListBullet"/>
+      </w:pPr>
+      <w:r>
+        <w:t>Soil Remediation &amp; Land Restoration</w:t>
       </w:r>
     </w:p>
     <w:p>
@@ -1872,23 +2102,39 @@
         <w:pStyle w:val="ListBullet"/>
       </w:pPr>
       <w:r>
-        <w:t>Clinical Services: Primary Care, Specialty Care</w:t>
-      </w:r>
-    </w:p>
-    <w:p>
-      <w:pPr>
-        <w:pStyle w:val="ListBullet"/>
-      </w:pPr>
-      <w:r>
-        <w:t>Telehealth: Virtual Consultations, Remote Monitoring</w:t>
-      </w:r>
-    </w:p>
-    <w:p>
-      <w:pPr>
-        <w:pStyle w:val="ListBullet"/>
-      </w:pPr>
-      <w:r>
-        <w:t>Hospital &amp; Clinic Operations (NEW)</w:t>
+        <w:t>Clinical Services: Primary Care, Specialty Care, Chronic Disease Management</w:t>
+      </w:r>
+    </w:p>
+    <w:p>
+      <w:pPr>
+        <w:pStyle w:val="ListBullet"/>
+      </w:pPr>
+      <w:r>
+        <w:t>Telehealth: Virtual Consultations, Remote Patient Monitoring</w:t>
+      </w:r>
+    </w:p>
+    <w:p>
+      <w:pPr>
+        <w:pStyle w:val="ListBullet"/>
+      </w:pPr>
+      <w:r>
+        <w:t>Hospital &amp; Clinic Operations: Greenfield Hospitals, Specialist Clinics</w:t>
+      </w:r>
+    </w:p>
+    <w:p>
+      <w:pPr>
+        <w:pStyle w:val="ListBullet"/>
+      </w:pPr>
+      <w:r>
+        <w:t>Mental Health &amp; Wellness: Counselling, Psychiatric Services, Corporate Wellness</w:t>
+      </w:r>
+    </w:p>
+    <w:p>
+      <w:pPr>
+        <w:pStyle w:val="ListBullet"/>
+      </w:pPr>
+      <w:r>
+        <w:t>Maternal, Neonatal &amp; Child Health Programs</w:t>
       </w:r>
     </w:p>
     <w:p>
@@ -1898,31 +2144,47 @@
           <w:i w:val="0"/>
           <w:color w:val="0B1F3A"/>
         </w:rPr>
-        <w:t>Pharmaceuticals</w:t>
-      </w:r>
-    </w:p>
-    <w:p>
-      <w:pPr>
-        <w:pStyle w:val="ListBullet"/>
-      </w:pPr>
-      <w:r>
-        <w:t>Pharmacy Operations: Retail, Wholesale</w:t>
-      </w:r>
-    </w:p>
-    <w:p>
-      <w:pPr>
-        <w:pStyle w:val="ListBullet"/>
-      </w:pPr>
-      <w:r>
-        <w:t>Medical Supplies: Equipment Distribution, Consumables</w:t>
-      </w:r>
-    </w:p>
-    <w:p>
-      <w:pPr>
-        <w:pStyle w:val="ListBullet"/>
-      </w:pPr>
-      <w:r>
-        <w:t>Chemical &amp; Laboratory Distribution: Lab Chemicals, Medical Chemicals, Research Chemicals, Pharmaceutical Inputs</w:t>
+        <w:t>Pharmaceuticals &amp; Medical Supplies</w:t>
+      </w:r>
+    </w:p>
+    <w:p>
+      <w:pPr>
+        <w:pStyle w:val="ListBullet"/>
+      </w:pPr>
+      <w:r>
+        <w:t>Pharmacy Operations: Retail Pharmacy Chains, Hospital Pharmacy</w:t>
+      </w:r>
+    </w:p>
+    <w:p>
+      <w:pPr>
+        <w:pStyle w:val="ListBullet"/>
+      </w:pPr>
+      <w:r>
+        <w:t>Pharmaceutical Manufacturing: Generic Drugs, OTC Products</w:t>
+      </w:r>
+    </w:p>
+    <w:p>
+      <w:pPr>
+        <w:pStyle w:val="ListBullet"/>
+      </w:pPr>
+      <w:r>
+        <w:t>Medical Supplies: Equipment Distribution, Consumables, PPE</w:t>
+      </w:r>
+    </w:p>
+    <w:p>
+      <w:pPr>
+        <w:pStyle w:val="ListBullet"/>
+      </w:pPr>
+      <w:r>
+        <w:t>Chemical &amp; Laboratory Distribution: Lab Chemicals, Pharmaceutical Inputs</w:t>
+      </w:r>
+    </w:p>
+    <w:p>
+      <w:pPr>
+        <w:pStyle w:val="ListBullet"/>
+      </w:pPr>
+      <w:r>
+        <w:t>Cold Chain Pharmaceutical Logistics</w:t>
       </w:r>
     </w:p>
     <w:p>
@@ -1932,31 +2194,39 @@
           <w:i w:val="0"/>
           <w:color w:val="0B1F3A"/>
         </w:rPr>
-        <w:t>Life Sciences</w:t>
-      </w:r>
-    </w:p>
-    <w:p>
-      <w:pPr>
-        <w:pStyle w:val="ListBullet"/>
-      </w:pPr>
-      <w:r>
-        <w:t>Laboratory Services: Diagnostics, Clinical Testing</w:t>
-      </w:r>
-    </w:p>
-    <w:p>
-      <w:pPr>
-        <w:pStyle w:val="ListBullet"/>
-      </w:pPr>
-      <w:r>
-        <w:t>Biotechnology: Research, Innovation Programs</w:t>
-      </w:r>
-    </w:p>
-    <w:p>
-      <w:pPr>
-        <w:pStyle w:val="ListBullet"/>
-      </w:pPr>
-      <w:r>
-        <w:t>Contract Research Organisation (NEW)</w:t>
+        <w:t>Life Sciences &amp; Biotechnology</w:t>
+      </w:r>
+    </w:p>
+    <w:p>
+      <w:pPr>
+        <w:pStyle w:val="ListBullet"/>
+      </w:pPr>
+      <w:r>
+        <w:t>Laboratory Services: Diagnostics, Clinical Testing, Pathology</w:t>
+      </w:r>
+    </w:p>
+    <w:p>
+      <w:pPr>
+        <w:pStyle w:val="ListBullet"/>
+      </w:pPr>
+      <w:r>
+        <w:t>Biotechnology: Drug Discovery, Biologics, Gene Therapy Research</w:t>
+      </w:r>
+    </w:p>
+    <w:p>
+      <w:pPr>
+        <w:pStyle w:val="ListBullet"/>
+      </w:pPr>
+      <w:r>
+        <w:t>Contract Research Organisation (CRO): Clinical Trials, Regulatory Affairs</w:t>
+      </w:r>
+    </w:p>
+    <w:p>
+      <w:pPr>
+        <w:pStyle w:val="ListBullet"/>
+      </w:pPr>
+      <w:r>
+        <w:t>Genomics &amp; Personalized Medicine: Genetic Testing, Precision Oncology</w:t>
       </w:r>
     </w:p>
     <w:p>
@@ -1974,23 +2244,31 @@
         <w:pStyle w:val="ListBullet"/>
       </w:pPr>
       <w:r>
-        <w:t>Electronic Medical Records: EMR, Hospital Information Systems</w:t>
-      </w:r>
-    </w:p>
-    <w:p>
-      <w:pPr>
-        <w:pStyle w:val="ListBullet"/>
-      </w:pPr>
-      <w:r>
-        <w:t>Telemedicine Platforms</w:t>
-      </w:r>
-    </w:p>
-    <w:p>
-      <w:pPr>
-        <w:pStyle w:val="ListBullet"/>
-      </w:pPr>
-      <w:r>
-        <w:t>Health Analytics</w:t>
+        <w:t>Electronic Medical Records: EMR/EHR, Hospital Information Systems</w:t>
+      </w:r>
+    </w:p>
+    <w:p>
+      <w:pPr>
+        <w:pStyle w:val="ListBullet"/>
+      </w:pPr>
+      <w:r>
+        <w:t>Telemedicine Platforms &amp; Digital Health Apps</w:t>
+      </w:r>
+    </w:p>
+    <w:p>
+      <w:pPr>
+        <w:pStyle w:val="ListBullet"/>
+      </w:pPr>
+      <w:r>
+        <w:t>Health Analytics: Population Health, Predictive Risk Stratification</w:t>
+      </w:r>
+    </w:p>
+    <w:p>
+      <w:pPr>
+        <w:pStyle w:val="ListBullet"/>
+      </w:pPr>
+      <w:r>
+        <w:t>AI-Powered Diagnostics &amp; Radiology AI</w:t>
       </w:r>
     </w:p>
     <w:p>
@@ -2000,23 +2278,23 @@
           <w:i w:val="0"/>
           <w:color w:val="0B1F3A"/>
         </w:rPr>
-        <w:t>Medical Devices &amp; Diagnostics (NEW)</w:t>
-      </w:r>
-    </w:p>
-    <w:p>
-      <w:pPr>
-        <w:pStyle w:val="ListBullet"/>
-      </w:pPr>
-      <w:r>
-        <w:t>Imaging Equipment</w:t>
-      </w:r>
-    </w:p>
-    <w:p>
-      <w:pPr>
-        <w:pStyle w:val="ListBullet"/>
-      </w:pPr>
-      <w:r>
-        <w:t>Diagnostic Devices</w:t>
+        <w:t>Medical Devices &amp; Diagnostics</w:t>
+      </w:r>
+    </w:p>
+    <w:p>
+      <w:pPr>
+        <w:pStyle w:val="ListBullet"/>
+      </w:pPr>
+      <w:r>
+        <w:t>Imaging Equipment: MRI, CT, Ultrasound</w:t>
+      </w:r>
+    </w:p>
+    <w:p>
+      <w:pPr>
+        <w:pStyle w:val="ListBullet"/>
+      </w:pPr>
+      <w:r>
+        <w:t>Diagnostic Devices: Point-of-Care Testing, In-Vitro Diagnostics</w:t>
       </w:r>
     </w:p>
     <w:p>
@@ -2025,6 +2303,14 @@
       </w:pPr>
       <w:r>
         <w:t>Wearables &amp; Remote Patient Monitoring Hardware</w:t>
+      </w:r>
+    </w:p>
+    <w:p>
+      <w:pPr>
+        <w:pStyle w:val="ListBullet"/>
+      </w:pPr>
+      <w:r>
+        <w:t>Surgical Robotics &amp; Minimally Invasive Tools</w:t>
       </w:r>
     </w:p>
     <w:p>
@@ -2172,7 +2458,7 @@
           <w:i/>
           <w:color w:val="555555"/>
         </w:rPr>
-        <w:t>Tourism, hospitality, travel, mobility, automotive, aviation and maritime.</w:t>
+        <w:t>Tourism, hospitality, mobility, automotive, aviation and maritime.</w:t>
       </w:r>
     </w:p>
     <w:p>
@@ -2217,39 +2503,47 @@
           <w:i w:val="0"/>
           <w:color w:val="0B1F3A"/>
         </w:rPr>
-        <w:t>Tourism</w:t>
-      </w:r>
-    </w:p>
-    <w:p>
-      <w:pPr>
-        <w:pStyle w:val="ListBullet"/>
-      </w:pPr>
-      <w:r>
-        <w:t>Tourism Camps: Eco-Tourism, Adventure</w:t>
-      </w:r>
-    </w:p>
-    <w:p>
-      <w:pPr>
-        <w:pStyle w:val="ListBullet"/>
-      </w:pPr>
-      <w:r>
-        <w:t>Destination Management: Planning, Marketing</w:t>
-      </w:r>
-    </w:p>
-    <w:p>
-      <w:pPr>
-        <w:pStyle w:val="ListBullet"/>
-      </w:pPr>
-      <w:r>
-        <w:t>Tour Operations: Guided Tours, Cultural Tours</w:t>
-      </w:r>
-    </w:p>
-    <w:p>
-      <w:pPr>
-        <w:pStyle w:val="ListBullet"/>
-      </w:pPr>
-      <w:r>
-        <w:t>Cultural Tourism: Heritage Programs, Cultural Events</w:t>
+        <w:t>Tourism &amp; Travel Services</w:t>
+      </w:r>
+    </w:p>
+    <w:p>
+      <w:pPr>
+        <w:pStyle w:val="ListBullet"/>
+      </w:pPr>
+      <w:r>
+        <w:t>Tourism Camps: Eco-Tourism, Adventure, Safari</w:t>
+      </w:r>
+    </w:p>
+    <w:p>
+      <w:pPr>
+        <w:pStyle w:val="ListBullet"/>
+      </w:pPr>
+      <w:r>
+        <w:t>Destination Management: Planning, Marketing, MICE (Meetings, Incentives, Conferences, Events)</w:t>
+      </w:r>
+    </w:p>
+    <w:p>
+      <w:pPr>
+        <w:pStyle w:val="ListBullet"/>
+      </w:pPr>
+      <w:r>
+        <w:t>Tour Operations: Guided Tours, Cultural Tours, Heritage Programs</w:t>
+      </w:r>
+    </w:p>
+    <w:p>
+      <w:pPr>
+        <w:pStyle w:val="ListBullet"/>
+      </w:pPr>
+      <w:r>
+        <w:t>Travel Agency: Flight, Hotel, Cruise Booking</w:t>
+      </w:r>
+    </w:p>
+    <w:p>
+      <w:pPr>
+        <w:pStyle w:val="ListBullet"/>
+      </w:pPr>
+      <w:r>
+        <w:t>Corporate Travel Management &amp; Executive Travel</w:t>
       </w:r>
     </w:p>
     <w:p>
@@ -2267,7 +2561,15 @@
         <w:pStyle w:val="ListBullet"/>
       </w:pPr>
       <w:r>
-        <w:t>Hotels &amp; Resorts: Business, Luxury, Beach, Eco</w:t>
+        <w:t>Hotels &amp; Resorts: Business, Luxury, Beach, Eco, Budget</w:t>
+      </w:r>
+    </w:p>
+    <w:p>
+      <w:pPr>
+        <w:pStyle w:val="ListBullet"/>
+      </w:pPr>
+      <w:r>
+        <w:t>Serviced Apartments &amp; Extended-Stay Properties</w:t>
       </w:r>
     </w:p>
     <w:p>
@@ -2276,6 +2578,22 @@
       </w:pPr>
       <w:r>
         <w:t>Event &amp; Conference Centers: Conventions, Corporate Events, Weddings, Exhibitions</w:t>
+      </w:r>
+    </w:p>
+    <w:p>
+      <w:pPr>
+        <w:pStyle w:val="ListBullet"/>
+      </w:pPr>
+      <w:r>
+        <w:t>Food &amp; Beverage Operations: Restaurants, Cafes, In-Hotel Dining</w:t>
+      </w:r>
+    </w:p>
+    <w:p>
+      <w:pPr>
+        <w:pStyle w:val="ListBullet"/>
+      </w:pPr>
+      <w:r>
+        <w:t>Spa, Wellness &amp; Recreation Facilities</w:t>
       </w:r>
     </w:p>
     <w:p>
@@ -2285,23 +2603,47 @@
           <w:i w:val="0"/>
           <w:color w:val="0B1F3A"/>
         </w:rPr>
-        <w:t>Travel Services</w:t>
-      </w:r>
-    </w:p>
-    <w:p>
-      <w:pPr>
-        <w:pStyle w:val="ListBullet"/>
-      </w:pPr>
-      <w:r>
-        <w:t>Travel Agency: Flight, Hotel Booking</w:t>
-      </w:r>
-    </w:p>
-    <w:p>
-      <w:pPr>
-        <w:pStyle w:val="ListBullet"/>
-      </w:pPr>
-      <w:r>
-        <w:t>Corporate Travel: Business Travel Management, Executive Travel</w:t>
+        <w:t>Mobility &amp; Automotive</w:t>
+      </w:r>
+    </w:p>
+    <w:p>
+      <w:pPr>
+        <w:pStyle w:val="ListBullet"/>
+      </w:pPr>
+      <w:r>
+        <w:t>Vehicle Rentals: Daily Rentals, Fleet Leasing, Chauffeur Services</w:t>
+      </w:r>
+    </w:p>
+    <w:p>
+      <w:pPr>
+        <w:pStyle w:val="ListBullet"/>
+      </w:pPr>
+      <w:r>
+        <w:t>Transportation: Shuttle, Corporate Transportation, Airport Transfers</w:t>
+      </w:r>
+    </w:p>
+    <w:p>
+      <w:pPr>
+        <w:pStyle w:val="ListBullet"/>
+      </w:pPr>
+      <w:r>
+        <w:t>Ride-Hailing &amp; Last-Mile Mobility Platforms</w:t>
+      </w:r>
+    </w:p>
+    <w:p>
+      <w:pPr>
+        <w:pStyle w:val="ListBullet"/>
+      </w:pPr>
+      <w:r>
+        <w:t>Vehicle Sales: New and Pre-Owned</w:t>
+      </w:r>
+    </w:p>
+    <w:p>
+      <w:pPr>
+        <w:pStyle w:val="ListBullet"/>
+      </w:pPr>
+      <w:r>
+        <w:t>Auto Repair: Maintenance, Diagnostics, Body Shop</w:t>
       </w:r>
     </w:p>
     <w:p>
@@ -2311,31 +2653,47 @@
           <w:i w:val="0"/>
           <w:color w:val="0B1F3A"/>
         </w:rPr>
-        <w:t>Mobility</w:t>
-      </w:r>
-    </w:p>
-    <w:p>
-      <w:pPr>
-        <w:pStyle w:val="ListBullet"/>
-      </w:pPr>
-      <w:r>
-        <w:t>Vehicle Rentals: Daily Rentals, Fleet Leasing</w:t>
-      </w:r>
-    </w:p>
-    <w:p>
-      <w:pPr>
-        <w:pStyle w:val="ListBullet"/>
-      </w:pPr>
-      <w:r>
-        <w:t>Transportation: Shuttle, Corporate Transportation</w:t>
-      </w:r>
-    </w:p>
-    <w:p>
-      <w:pPr>
-        <w:pStyle w:val="ListBullet"/>
-      </w:pPr>
-      <w:r>
-        <w:t>Ride-Hailing &amp; Last-Mile Mobility (NEW)</w:t>
+        <w:t>Aviation</w:t>
+      </w:r>
+    </w:p>
+    <w:p>
+      <w:pPr>
+        <w:pStyle w:val="ListBullet"/>
+      </w:pPr>
+      <w:r>
+        <w:t>Charter &amp; Executive Aviation</w:t>
+      </w:r>
+    </w:p>
+    <w:p>
+      <w:pPr>
+        <w:pStyle w:val="ListBullet"/>
+      </w:pPr>
+      <w:r>
+        <w:t>Scheduled Regional Air Services</w:t>
+      </w:r>
+    </w:p>
+    <w:p>
+      <w:pPr>
+        <w:pStyle w:val="ListBullet"/>
+      </w:pPr>
+      <w:r>
+        <w:t>MRO (Maintenance, Repair, Overhaul)</w:t>
+      </w:r>
+    </w:p>
+    <w:p>
+      <w:pPr>
+        <w:pStyle w:val="ListBullet"/>
+      </w:pPr>
+      <w:r>
+        <w:t>Ground Handling &amp; Airport Services</w:t>
+      </w:r>
+    </w:p>
+    <w:p>
+      <w:pPr>
+        <w:pStyle w:val="ListBullet"/>
+      </w:pPr>
+      <w:r>
+        <w:t>Cargo Aviation &amp; Air Freight</w:t>
       </w:r>
     </w:p>
     <w:p>
@@ -2345,83 +2703,7 @@
           <w:i w:val="0"/>
           <w:color w:val="0B1F3A"/>
         </w:rPr>
-        <w:t>Automotive</w:t>
-      </w:r>
-    </w:p>
-    <w:p>
-      <w:pPr>
-        <w:pStyle w:val="ListBullet"/>
-      </w:pPr>
-      <w:r>
-        <w:t>Vehicle Sales: New, Used</w:t>
-      </w:r>
-    </w:p>
-    <w:p>
-      <w:pPr>
-        <w:pStyle w:val="ListBullet"/>
-      </w:pPr>
-      <w:r>
-        <w:t>Auto Repair: Maintenance, Diagnostics</w:t>
-      </w:r>
-    </w:p>
-    <w:p>
-      <w:pPr>
-        <w:pStyle w:val="ListBullet"/>
-      </w:pPr>
-      <w:r>
-        <w:t>Auto Finance &amp; Insurance (NEW)</w:t>
-      </w:r>
-    </w:p>
-    <w:p>
-      <w:r>
-        <w:rPr>
-          <w:b/>
-          <w:i w:val="0"/>
-          <w:color w:val="0B1F3A"/>
-        </w:rPr>
-        <w:t>Aviation (NEW)</w:t>
-      </w:r>
-    </w:p>
-    <w:p>
-      <w:pPr>
-        <w:pStyle w:val="ListBullet"/>
-      </w:pPr>
-      <w:r>
-        <w:t>Charter &amp; Executive Aviation</w:t>
-      </w:r>
-    </w:p>
-    <w:p>
-      <w:pPr>
-        <w:pStyle w:val="ListBullet"/>
-      </w:pPr>
-      <w:r>
-        <w:t>MRO (Maintenance, Repair, Overhaul)</w:t>
-      </w:r>
-    </w:p>
-    <w:p>
-      <w:pPr>
-        <w:pStyle w:val="ListBullet"/>
-      </w:pPr>
-      <w:r>
-        <w:t>Ground Handling &amp; Airport Services</w:t>
-      </w:r>
-    </w:p>
-    <w:p>
-      <w:pPr>
-        <w:pStyle w:val="ListBullet"/>
-      </w:pPr>
-      <w:r>
-        <w:t>Cargo Aviation</w:t>
-      </w:r>
-    </w:p>
-    <w:p>
-      <w:r>
-        <w:rPr>
-          <w:b/>
-          <w:i w:val="0"/>
-          <w:color w:val="0B1F3A"/>
-        </w:rPr>
-        <w:t>Maritime &amp; Ports (NEW)</w:t>
+        <w:t>Maritime &amp; Ports</w:t>
       </w:r>
     </w:p>
     <w:p>
@@ -2437,7 +2719,7 @@
         <w:pStyle w:val="ListBullet"/>
       </w:pPr>
       <w:r>
-        <w:t>Port Operations &amp; Terminals</w:t>
+        <w:t>Port Operations, Terminal Management</w:t>
       </w:r>
     </w:p>
     <w:p>
@@ -2453,7 +2735,15 @@
         <w:pStyle w:val="ListBullet"/>
       </w:pPr>
       <w:r>
-        <w:t>Marine Services</w:t>
+        <w:t>Marine Services: Ship Agency, Marine Surveys, Towage</w:t>
+      </w:r>
+    </w:p>
+    <w:p>
+      <w:pPr>
+        <w:pStyle w:val="ListBullet"/>
+      </w:pPr>
+      <w:r>
+        <w:t>Offshore Support Vessels</w:t>
       </w:r>
     </w:p>
     <w:p>
@@ -2662,15 +2952,15 @@
         <w:pStyle w:val="ListBullet"/>
       </w:pPr>
       <w:r>
-        <w:t>Professional Certifications: PMP, Security+, AWS, CISSP</w:t>
-      </w:r>
-    </w:p>
-    <w:p>
-      <w:pPr>
-        <w:pStyle w:val="ListBullet"/>
-      </w:pPr>
-      <w:r>
-        <w:t>Fast-Track Programs: Bootcamps, Intensive Courses</w:t>
+        <w:t>Professional Certifications: PMP, Security+, AWS, CISSP, CFA</w:t>
+      </w:r>
+    </w:p>
+    <w:p>
+      <w:pPr>
+        <w:pStyle w:val="ListBullet"/>
+      </w:pPr>
+      <w:r>
+        <w:t>Fast-Track Programs: Bootcamps, Intensive Courses, Hackathons</w:t>
       </w:r>
     </w:p>
     <w:p>
@@ -2704,15 +2994,31 @@
         <w:pStyle w:val="ListBullet"/>
       </w:pPr>
       <w:r>
-        <w:t>Online Degrees: Undergraduate, Graduate</w:t>
-      </w:r>
-    </w:p>
-    <w:p>
-      <w:pPr>
-        <w:pStyle w:val="ListBullet"/>
-      </w:pPr>
-      <w:r>
-        <w:t>Diplomas: Professional, Technical</w:t>
+        <w:t>Online Degrees: Undergraduate, Graduate, MBA</w:t>
+      </w:r>
+    </w:p>
+    <w:p>
+      <w:pPr>
+        <w:pStyle w:val="ListBullet"/>
+      </w:pPr>
+      <w:r>
+        <w:t>Diplomas: Professional, Technical, Vocational</w:t>
+      </w:r>
+    </w:p>
+    <w:p>
+      <w:pPr>
+        <w:pStyle w:val="ListBullet"/>
+      </w:pPr>
+      <w:r>
+        <w:t>Research Partnerships &amp; Academic Collaborations</w:t>
+      </w:r>
+    </w:p>
+    <w:p>
+      <w:pPr>
+        <w:pStyle w:val="ListBullet"/>
+      </w:pPr>
+      <w:r>
+        <w:t>Study-Abroad &amp; International Exchange Programs</w:t>
       </w:r>
     </w:p>
     <w:p>
@@ -2722,15 +3028,15 @@
           <w:i w:val="0"/>
           <w:color w:val="0B1F3A"/>
         </w:rPr>
-        <w:t>Workforce Development</w:t>
-      </w:r>
-    </w:p>
-    <w:p>
-      <w:pPr>
-        <w:pStyle w:val="ListBullet"/>
-      </w:pPr>
-      <w:r>
-        <w:t>Vocational Training: Trades, Technical Skills</w:t>
+        <w:t>Talent, Workforce &amp; Career Solutions</w:t>
+      </w:r>
+    </w:p>
+    <w:p>
+      <w:pPr>
+        <w:pStyle w:val="ListBullet"/>
+      </w:pPr>
+      <w:r>
+        <w:t>Vocational Training: Trades, Technical Skills, Apprenticeships</w:t>
       </w:r>
     </w:p>
     <w:p>
@@ -2739,6 +3045,30 @@
       </w:pPr>
       <w:r>
         <w:t>Leadership Development: Executive Programs, Management Training</w:t>
+      </w:r>
+    </w:p>
+    <w:p>
+      <w:pPr>
+        <w:pStyle w:val="ListBullet"/>
+      </w:pPr>
+      <w:r>
+        <w:t>Recruiting: Permanent Placement, Contract Staffing, Executive Search</w:t>
+      </w:r>
+    </w:p>
+    <w:p>
+      <w:pPr>
+        <w:pStyle w:val="ListBullet"/>
+      </w:pPr>
+      <w:r>
+        <w:t>Career Services: Resume Writing, Career Coaching, Interview Preparation</w:t>
+      </w:r>
+    </w:p>
+    <w:p>
+      <w:pPr>
+        <w:pStyle w:val="ListBullet"/>
+      </w:pPr>
+      <w:r>
+        <w:t>Managed Workforce: Staff Augmentation, Workforce Outsourcing, RPO</w:t>
       </w:r>
     </w:p>
     <w:p>
@@ -2748,41 +3078,7 @@
           <w:i w:val="0"/>
           <w:color w:val="0B1F3A"/>
         </w:rPr>
-        <w:t>Talent Solutions</w:t>
-      </w:r>
-    </w:p>
-    <w:p>
-      <w:pPr>
-        <w:pStyle w:val="ListBullet"/>
-      </w:pPr>
-      <w:r>
-        <w:t>Recruiting: Permanent Placement, Contract Staffing</w:t>
-      </w:r>
-    </w:p>
-    <w:p>
-      <w:pPr>
-        <w:pStyle w:val="ListBullet"/>
-      </w:pPr>
-      <w:r>
-        <w:t>Career Services: Resume Writing, Career Coaching</w:t>
-      </w:r>
-    </w:p>
-    <w:p>
-      <w:pPr>
-        <w:pStyle w:val="ListBullet"/>
-      </w:pPr>
-      <w:r>
-        <w:t>Managed Workforce: Staff Augmentation, Workforce Outsourcing, RPO, Executive Search</w:t>
-      </w:r>
-    </w:p>
-    <w:p>
-      <w:r>
-        <w:rPr>
-          <w:b/>
-          <w:i w:val="0"/>
-          <w:color w:val="0B1F3A"/>
-        </w:rPr>
-        <w:t>K-12 &amp; Early Education (NEW)</w:t>
+        <w:t>K-12 &amp; Early Education</w:t>
       </w:r>
     </w:p>
     <w:p>
@@ -2798,15 +3094,23 @@
         <w:pStyle w:val="ListBullet"/>
       </w:pPr>
       <w:r>
-        <w:t>STEM Enrichment Programs</w:t>
-      </w:r>
-    </w:p>
-    <w:p>
-      <w:pPr>
-        <w:pStyle w:val="ListBullet"/>
-      </w:pPr>
-      <w:r>
-        <w:t>Edutech Curriculum Licensing</w:t>
+        <w:t>STEM Enrichment &amp; Robotics Programs</w:t>
+      </w:r>
+    </w:p>
+    <w:p>
+      <w:pPr>
+        <w:pStyle w:val="ListBullet"/>
+      </w:pPr>
+      <w:r>
+        <w:t>Edutech Curriculum Licensing &amp; LMS Platforms</w:t>
+      </w:r>
+    </w:p>
+    <w:p>
+      <w:pPr>
+        <w:pStyle w:val="ListBullet"/>
+      </w:pPr>
+      <w:r>
+        <w:t>Early Childhood Development Centres</w:t>
       </w:r>
     </w:p>
     <w:p>
@@ -2999,31 +3303,39 @@
           <w:i w:val="0"/>
           <w:color w:val="0B1F3A"/>
         </w:rPr>
-        <w:t>Broadcasting</w:t>
-      </w:r>
-    </w:p>
-    <w:p>
-      <w:pPr>
-        <w:pStyle w:val="ListBullet"/>
-      </w:pPr>
-      <w:r>
-        <w:t>Television Networks</w:t>
-      </w:r>
-    </w:p>
-    <w:p>
-      <w:pPr>
-        <w:pStyle w:val="ListBullet"/>
-      </w:pPr>
-      <w:r>
-        <w:t>Radio Networks</w:t>
-      </w:r>
-    </w:p>
-    <w:p>
-      <w:pPr>
-        <w:pStyle w:val="ListBullet"/>
-      </w:pPr>
-      <w:r>
-        <w:t>Streaming Networks</w:t>
+        <w:t>Broadcasting &amp; Streaming</w:t>
+      </w:r>
+    </w:p>
+    <w:p>
+      <w:pPr>
+        <w:pStyle w:val="ListBullet"/>
+      </w:pPr>
+      <w:r>
+        <w:t>Television Networks: Free-to-Air, Cable, Satellite</w:t>
+      </w:r>
+    </w:p>
+    <w:p>
+      <w:pPr>
+        <w:pStyle w:val="ListBullet"/>
+      </w:pPr>
+      <w:r>
+        <w:t>Radio Networks: FM, Digital, Online</w:t>
+      </w:r>
+    </w:p>
+    <w:p>
+      <w:pPr>
+        <w:pStyle w:val="ListBullet"/>
+      </w:pPr>
+      <w:r>
+        <w:t>Streaming &amp; OTT Platforms</w:t>
+      </w:r>
+    </w:p>
+    <w:p>
+      <w:pPr>
+        <w:pStyle w:val="ListBullet"/>
+      </w:pPr>
+      <w:r>
+        <w:t>News &amp; Current Affairs Production</w:t>
       </w:r>
     </w:p>
     <w:p>
@@ -3033,31 +3345,31 @@
           <w:i w:val="0"/>
           <w:color w:val="0B1F3A"/>
         </w:rPr>
-        <w:t>Digital Media</w:t>
-      </w:r>
-    </w:p>
-    <w:p>
-      <w:pPr>
-        <w:pStyle w:val="ListBullet"/>
-      </w:pPr>
-      <w:r>
-        <w:t>Content Creation</w:t>
-      </w:r>
-    </w:p>
-    <w:p>
-      <w:pPr>
-        <w:pStyle w:val="ListBullet"/>
-      </w:pPr>
-      <w:r>
-        <w:t>Social Media Management</w:t>
-      </w:r>
-    </w:p>
-    <w:p>
-      <w:pPr>
-        <w:pStyle w:val="ListBullet"/>
-      </w:pPr>
-      <w:r>
-        <w:t>Podcast Production</w:t>
+        <w:t>Digital Media &amp; Creator Economy</w:t>
+      </w:r>
+    </w:p>
+    <w:p>
+      <w:pPr>
+        <w:pStyle w:val="ListBullet"/>
+      </w:pPr>
+      <w:r>
+        <w:t>Content Creation: Long-Form, Short-Form, Documentary</w:t>
+      </w:r>
+    </w:p>
+    <w:p>
+      <w:pPr>
+        <w:pStyle w:val="ListBullet"/>
+      </w:pPr>
+      <w:r>
+        <w:t>Social Media Management &amp; Community Building</w:t>
+      </w:r>
+    </w:p>
+    <w:p>
+      <w:pPr>
+        <w:pStyle w:val="ListBullet"/>
+      </w:pPr>
+      <w:r>
+        <w:t>Podcast Production &amp; Audio Content Networks</w:t>
       </w:r>
     </w:p>
     <w:p>
@@ -3066,6 +3378,14 @@
       </w:pPr>
       <w:r>
         <w:t>Digital Marketing: SEO, SEM, Social, Content, Email, Marketing Automation</w:t>
+      </w:r>
+    </w:p>
+    <w:p>
+      <w:pPr>
+        <w:pStyle w:val="ListBullet"/>
+      </w:pPr>
+      <w:r>
+        <w:t>Creator Economy &amp; Influencer Marketing Platforms</w:t>
       </w:r>
     </w:p>
     <w:p>
@@ -3075,31 +3395,39 @@
           <w:i w:val="0"/>
           <w:color w:val="0B1F3A"/>
         </w:rPr>
-        <w:t>Creative Services</w:t>
-      </w:r>
-    </w:p>
-    <w:p>
-      <w:pPr>
-        <w:pStyle w:val="ListBullet"/>
-      </w:pPr>
-      <w:r>
-        <w:t>Advertising</w:t>
-      </w:r>
-    </w:p>
-    <w:p>
-      <w:pPr>
-        <w:pStyle w:val="ListBullet"/>
-      </w:pPr>
-      <w:r>
-        <w:t>Public Relations</w:t>
-      </w:r>
-    </w:p>
-    <w:p>
-      <w:pPr>
-        <w:pStyle w:val="ListBullet"/>
-      </w:pPr>
-      <w:r>
-        <w:t>Branding &amp; Identity</w:t>
+        <w:t>Creative Services &amp; PR</w:t>
+      </w:r>
+    </w:p>
+    <w:p>
+      <w:pPr>
+        <w:pStyle w:val="ListBullet"/>
+      </w:pPr>
+      <w:r>
+        <w:t>Advertising: Campaign Development, Media Buying, OOH</w:t>
+      </w:r>
+    </w:p>
+    <w:p>
+      <w:pPr>
+        <w:pStyle w:val="ListBullet"/>
+      </w:pPr>
+      <w:r>
+        <w:t>Public Relations &amp; Crisis Communications</w:t>
+      </w:r>
+    </w:p>
+    <w:p>
+      <w:pPr>
+        <w:pStyle w:val="ListBullet"/>
+      </w:pPr>
+      <w:r>
+        <w:t>Branding &amp; Identity: Brand Strategy, Visual Identity, Naming</w:t>
+      </w:r>
+    </w:p>
+    <w:p>
+      <w:pPr>
+        <w:pStyle w:val="ListBullet"/>
+      </w:pPr>
+      <w:r>
+        <w:t>Content Localisation &amp; Multilingual Production</w:t>
       </w:r>
     </w:p>
     <w:p>
@@ -3109,39 +3437,47 @@
           <w:i w:val="0"/>
           <w:color w:val="0B1F3A"/>
         </w:rPr>
-        <w:t>Entertainment</w:t>
-      </w:r>
-    </w:p>
-    <w:p>
-      <w:pPr>
-        <w:pStyle w:val="ListBullet"/>
-      </w:pPr>
-      <w:r>
-        <w:t>Film Production</w:t>
-      </w:r>
-    </w:p>
-    <w:p>
-      <w:pPr>
-        <w:pStyle w:val="ListBullet"/>
-      </w:pPr>
-      <w:r>
-        <w:t>Music Production</w:t>
-      </w:r>
-    </w:p>
-    <w:p>
-      <w:pPr>
-        <w:pStyle w:val="ListBullet"/>
-      </w:pPr>
-      <w:r>
-        <w:t>Event Production</w:t>
-      </w:r>
-    </w:p>
-    <w:p>
-      <w:pPr>
-        <w:pStyle w:val="ListBullet"/>
-      </w:pPr>
-      <w:r>
-        <w:t>Sports Entertainment &amp; Live Events (NEW)</w:t>
+        <w:t>Entertainment &amp; Events</w:t>
+      </w:r>
+    </w:p>
+    <w:p>
+      <w:pPr>
+        <w:pStyle w:val="ListBullet"/>
+      </w:pPr>
+      <w:r>
+        <w:t>Film &amp; Series Production: Feature Films, TV Series, Documentaries</w:t>
+      </w:r>
+    </w:p>
+    <w:p>
+      <w:pPr>
+        <w:pStyle w:val="ListBullet"/>
+      </w:pPr>
+      <w:r>
+        <w:t>Music Production: Recording, Distribution, Artist Management</w:t>
+      </w:r>
+    </w:p>
+    <w:p>
+      <w:pPr>
+        <w:pStyle w:val="ListBullet"/>
+      </w:pPr>
+      <w:r>
+        <w:t>Live Event Production: Concerts, Award Shows, Cultural Festivals</w:t>
+      </w:r>
+    </w:p>
+    <w:p>
+      <w:pPr>
+        <w:pStyle w:val="ListBullet"/>
+      </w:pPr>
+      <w:r>
+        <w:t>Gaming &amp; Interactive Media: Game Development, Gaming Tournaments</w:t>
+      </w:r>
+    </w:p>
+    <w:p>
+      <w:pPr>
+        <w:pStyle w:val="ListBullet"/>
+      </w:pPr>
+      <w:r>
+        <w:t>Sports Entertainment &amp; Live Events Management</w:t>
       </w:r>
     </w:p>
     <w:p>
@@ -3151,15 +3487,15 @@
           <w:i w:val="0"/>
           <w:color w:val="0B1F3A"/>
         </w:rPr>
-        <w:t>Publishing (NEW)</w:t>
-      </w:r>
-    </w:p>
-    <w:p>
-      <w:pPr>
-        <w:pStyle w:val="ListBullet"/>
-      </w:pPr>
-      <w:r>
-        <w:t>Book Publishing</w:t>
+        <w:t>Publishing</w:t>
+      </w:r>
+    </w:p>
+    <w:p>
+      <w:pPr>
+        <w:pStyle w:val="ListBullet"/>
+      </w:pPr>
+      <w:r>
+        <w:t>Book Publishing: Fiction, Non-Fiction, Educational</w:t>
       </w:r>
     </w:p>
     <w:p>
@@ -3175,7 +3511,15 @@
         <w:pStyle w:val="ListBullet"/>
       </w:pPr>
       <w:r>
-        <w:t>Digital Publications</w:t>
+        <w:t>Digital Publications &amp; E-Books</w:t>
+      </w:r>
+    </w:p>
+    <w:p>
+      <w:pPr>
+        <w:pStyle w:val="ListBullet"/>
+      </w:pPr>
+      <w:r>
+        <w:t>Academic &amp; Technical Publishing</w:t>
       </w:r>
     </w:p>
     <w:p>
@@ -3376,23 +3720,31 @@
         <w:pStyle w:val="ListBullet"/>
       </w:pPr>
       <w:r>
-        <w:t>Import Services</w:t>
-      </w:r>
-    </w:p>
-    <w:p>
-      <w:pPr>
-        <w:pStyle w:val="ListBullet"/>
-      </w:pPr>
-      <w:r>
-        <w:t>Export Services</w:t>
-      </w:r>
-    </w:p>
-    <w:p>
-      <w:pPr>
-        <w:pStyle w:val="ListBullet"/>
-      </w:pPr>
-      <w:r>
-        <w:t>Trade Facilitation</w:t>
+        <w:t>Import &amp; Export Services</w:t>
+      </w:r>
+    </w:p>
+    <w:p>
+      <w:pPr>
+        <w:pStyle w:val="ListBullet"/>
+      </w:pPr>
+      <w:r>
+        <w:t>Trade Finance: Letters of Credit, Documentary Collections</w:t>
+      </w:r>
+    </w:p>
+    <w:p>
+      <w:pPr>
+        <w:pStyle w:val="ListBullet"/>
+      </w:pPr>
+      <w:r>
+        <w:t>Customs Brokerage &amp; Trade Facilitation</w:t>
+      </w:r>
+    </w:p>
+    <w:p>
+      <w:pPr>
+        <w:pStyle w:val="ListBullet"/>
+      </w:pPr>
+      <w:r>
+        <w:t>Free Zone &amp; Special Economic Zone Operations</w:t>
       </w:r>
     </w:p>
     <w:p>
@@ -3402,23 +3754,39 @@
           <w:i w:val="0"/>
           <w:color w:val="0B1F3A"/>
         </w:rPr>
-        <w:t>Distribution</w:t>
-      </w:r>
-    </w:p>
-    <w:p>
-      <w:pPr>
-        <w:pStyle w:val="ListBullet"/>
-      </w:pPr>
-      <w:r>
-        <w:t>Wholesale Distribution</w:t>
-      </w:r>
-    </w:p>
-    <w:p>
-      <w:pPr>
-        <w:pStyle w:val="ListBullet"/>
-      </w:pPr>
-      <w:r>
-        <w:t>Supply Chain Distribution</w:t>
+        <w:t>E-Commerce &amp; Digital Retail</w:t>
+      </w:r>
+    </w:p>
+    <w:p>
+      <w:pPr>
+        <w:pStyle w:val="ListBullet"/>
+      </w:pPr>
+      <w:r>
+        <w:t>Online Marketplace Platforms</w:t>
+      </w:r>
+    </w:p>
+    <w:p>
+      <w:pPr>
+        <w:pStyle w:val="ListBullet"/>
+      </w:pPr>
+      <w:r>
+        <w:t>Cross-Border E-Commerce &amp; Dropshipping</w:t>
+      </w:r>
+    </w:p>
+    <w:p>
+      <w:pPr>
+        <w:pStyle w:val="ListBullet"/>
+      </w:pPr>
+      <w:r>
+        <w:t>Digital Commerce Infrastructure: Payments, Logistics Integration</w:t>
+      </w:r>
+    </w:p>
+    <w:p>
+      <w:pPr>
+        <w:pStyle w:val="ListBullet"/>
+      </w:pPr>
+      <w:r>
+        <w:t>Direct-to-Consumer (DTC) Brand Platforms</w:t>
       </w:r>
     </w:p>
     <w:p>
@@ -3428,31 +3796,47 @@
           <w:i w:val="0"/>
           <w:color w:val="0B1F3A"/>
         </w:rPr>
-        <w:t>E-Commerce</w:t>
-      </w:r>
-    </w:p>
-    <w:p>
-      <w:pPr>
-        <w:pStyle w:val="ListBullet"/>
-      </w:pPr>
-      <w:r>
-        <w:t>Online Marketplace</w:t>
-      </w:r>
-    </w:p>
-    <w:p>
-      <w:pPr>
-        <w:pStyle w:val="ListBullet"/>
-      </w:pPr>
-      <w:r>
-        <w:t>Digital Commerce Platforms</w:t>
-      </w:r>
-    </w:p>
-    <w:p>
-      <w:pPr>
-        <w:pStyle w:val="ListBullet"/>
-      </w:pPr>
-      <w:r>
-        <w:t>Cross-Border E-Commerce (NEW)</w:t>
+        <w:t>Retail &amp; Consumer</w:t>
+      </w:r>
+    </w:p>
+    <w:p>
+      <w:pPr>
+        <w:pStyle w:val="ListBullet"/>
+      </w:pPr>
+      <w:r>
+        <w:t>Consumer Retail: FMCG, Electronics, Lifestyle</w:t>
+      </w:r>
+    </w:p>
+    <w:p>
+      <w:pPr>
+        <w:pStyle w:val="ListBullet"/>
+      </w:pPr>
+      <w:r>
+        <w:t>Franchise Operations &amp; Brand Licensing</w:t>
+      </w:r>
+    </w:p>
+    <w:p>
+      <w:pPr>
+        <w:pStyle w:val="ListBullet"/>
+      </w:pPr>
+      <w:r>
+        <w:t>Luxury Goods &amp; Premium Retail</w:t>
+      </w:r>
+    </w:p>
+    <w:p>
+      <w:pPr>
+        <w:pStyle w:val="ListBullet"/>
+      </w:pPr>
+      <w:r>
+        <w:t>Department Stores, Shopping Malls &amp; Specialty Retail</w:t>
+      </w:r>
+    </w:p>
+    <w:p>
+      <w:pPr>
+        <w:pStyle w:val="ListBullet"/>
+      </w:pPr>
+      <w:r>
+        <w:t>Afrofashion &amp; Cultural Lifestyle Retail</w:t>
       </w:r>
     </w:p>
     <w:p>
@@ -3462,73 +3846,47 @@
           <w:i w:val="0"/>
           <w:color w:val="0B1F3A"/>
         </w:rPr>
-        <w:t>Retail</w:t>
-      </w:r>
-    </w:p>
-    <w:p>
-      <w:pPr>
-        <w:pStyle w:val="ListBullet"/>
-      </w:pPr>
-      <w:r>
-        <w:t>Consumer Retail</w:t>
-      </w:r>
-    </w:p>
-    <w:p>
-      <w:pPr>
-        <w:pStyle w:val="ListBullet"/>
-      </w:pPr>
-      <w:r>
-        <w:t>Franchise Operations</w:t>
-      </w:r>
-    </w:p>
-    <w:p>
-      <w:pPr>
-        <w:pStyle w:val="ListBullet"/>
-      </w:pPr>
-      <w:r>
-        <w:t>Department Stores &amp; Specialty Retail (NEW)</w:t>
-      </w:r>
-    </w:p>
-    <w:p>
-      <w:r>
-        <w:rPr>
-          <w:b/>
-          <w:i w:val="0"/>
-          <w:color w:val="0B1F3A"/>
-        </w:rPr>
-        <w:t>Procurement &amp; Sourcing</w:t>
-      </w:r>
-    </w:p>
-    <w:p>
-      <w:pPr>
-        <w:pStyle w:val="ListBullet"/>
-      </w:pPr>
-      <w:r>
-        <w:t>Strategic Sourcing</w:t>
-      </w:r>
-    </w:p>
-    <w:p>
-      <w:pPr>
-        <w:pStyle w:val="ListBullet"/>
-      </w:pPr>
-      <w:r>
-        <w:t>Vendor Management</w:t>
-      </w:r>
-    </w:p>
-    <w:p>
-      <w:pPr>
-        <w:pStyle w:val="ListBullet"/>
-      </w:pPr>
-      <w:r>
-        <w:t>Contract Management</w:t>
-      </w:r>
-    </w:p>
-    <w:p>
-      <w:pPr>
-        <w:pStyle w:val="ListBullet"/>
-      </w:pPr>
-      <w:r>
-        <w:t>Global Procurement</w:t>
+        <w:t>Procurement, Distribution &amp; Sourcing</w:t>
+      </w:r>
+    </w:p>
+    <w:p>
+      <w:pPr>
+        <w:pStyle w:val="ListBullet"/>
+      </w:pPr>
+      <w:r>
+        <w:t>Strategic Sourcing &amp; Vendor Management</w:t>
+      </w:r>
+    </w:p>
+    <w:p>
+      <w:pPr>
+        <w:pStyle w:val="ListBullet"/>
+      </w:pPr>
+      <w:r>
+        <w:t>Contract &amp; Framework Agreement Management</w:t>
+      </w:r>
+    </w:p>
+    <w:p>
+      <w:pPr>
+        <w:pStyle w:val="ListBullet"/>
+      </w:pPr>
+      <w:r>
+        <w:t>Wholesale Distribution &amp; Supply Chain Distribution</w:t>
+      </w:r>
+    </w:p>
+    <w:p>
+      <w:pPr>
+        <w:pStyle w:val="ListBullet"/>
+      </w:pPr>
+      <w:r>
+        <w:t>Global Procurement &amp; Group Buying Services</w:t>
+      </w:r>
+    </w:p>
+    <w:p>
+      <w:pPr>
+        <w:pStyle w:val="ListBullet"/>
+      </w:pPr>
+      <w:r>
+        <w:t>Reverse Logistics &amp; Returns Management</w:t>
       </w:r>
     </w:p>
     <w:p>
@@ -3721,31 +4079,39 @@
           <w:i w:val="0"/>
           <w:color w:val="0B1F3A"/>
         </w:rPr>
-        <w:t>Government Consulting</w:t>
-      </w:r>
-    </w:p>
-    <w:p>
-      <w:pPr>
-        <w:pStyle w:val="ListBullet"/>
-      </w:pPr>
-      <w:r>
-        <w:t>Public Sector Advisory</w:t>
-      </w:r>
-    </w:p>
-    <w:p>
-      <w:pPr>
-        <w:pStyle w:val="ListBullet"/>
-      </w:pPr>
-      <w:r>
-        <w:t>Government Modernization</w:t>
-      </w:r>
-    </w:p>
-    <w:p>
-      <w:pPr>
-        <w:pStyle w:val="ListBullet"/>
-      </w:pPr>
-      <w:r>
-        <w:t>Policy Implementation Support</w:t>
+        <w:t>Government Consulting &amp; Advisory</w:t>
+      </w:r>
+    </w:p>
+    <w:p>
+      <w:pPr>
+        <w:pStyle w:val="ListBullet"/>
+      </w:pPr>
+      <w:r>
+        <w:t>Public Sector Strategy &amp; Transformation</w:t>
+      </w:r>
+    </w:p>
+    <w:p>
+      <w:pPr>
+        <w:pStyle w:val="ListBullet"/>
+      </w:pPr>
+      <w:r>
+        <w:t>Government Modernisation: Digital Government, Public Finance Reform</w:t>
+      </w:r>
+    </w:p>
+    <w:p>
+      <w:pPr>
+        <w:pStyle w:val="ListBullet"/>
+      </w:pPr>
+      <w:r>
+        <w:t>Policy Implementation Support &amp; Regulatory Advisory</w:t>
+      </w:r>
+    </w:p>
+    <w:p>
+      <w:pPr>
+        <w:pStyle w:val="ListBullet"/>
+      </w:pPr>
+      <w:r>
+        <w:t>Homeland Security Consulting: Border Management, Immigration Systems</w:t>
       </w:r>
     </w:p>
     <w:p>
@@ -3763,23 +4129,39 @@
         <w:pStyle w:val="ListBullet"/>
       </w:pPr>
       <w:r>
-        <w:t>Cyber Defense</w:t>
-      </w:r>
-    </w:p>
-    <w:p>
-      <w:pPr>
-        <w:pStyle w:val="ListBullet"/>
-      </w:pPr>
-      <w:r>
-        <w:t>Command &amp; Control Systems</w:t>
-      </w:r>
-    </w:p>
-    <w:p>
-      <w:pPr>
-        <w:pStyle w:val="ListBullet"/>
-      </w:pPr>
-      <w:r>
-        <w:t>ISR (Intelligence, Surveillance, Reconnaissance)</w:t>
+        <w:t>Cyber Defense: Threat Intelligence, Military SIEM, Classified Networks</w:t>
+      </w:r>
+    </w:p>
+    <w:p>
+      <w:pPr>
+        <w:pStyle w:val="ListBullet"/>
+      </w:pPr>
+      <w:r>
+        <w:t>Command, Control, Communications, Computers &amp; Intelligence (C4I)</w:t>
+      </w:r>
+    </w:p>
+    <w:p>
+      <w:pPr>
+        <w:pStyle w:val="ListBullet"/>
+      </w:pPr>
+      <w:r>
+        <w:t>ISR: Intelligence, Surveillance, Reconnaissance Systems</w:t>
+      </w:r>
+    </w:p>
+    <w:p>
+      <w:pPr>
+        <w:pStyle w:val="ListBullet"/>
+      </w:pPr>
+      <w:r>
+        <w:t>Electronic Warfare &amp; Signal Intelligence (SIGINT)</w:t>
+      </w:r>
+    </w:p>
+    <w:p>
+      <w:pPr>
+        <w:pStyle w:val="ListBullet"/>
+      </w:pPr>
+      <w:r>
+        <w:t>Cybercrime Investigation &amp; Digital Forensics</w:t>
       </w:r>
     </w:p>
     <w:p>
@@ -3797,7 +4179,31 @@
         <w:pStyle w:val="ListBullet"/>
       </w:pPr>
       <w:r>
-        <w:t>Physical Security: Armed Guards, Unarmed Guards, Event Security, Executive Protection, VIP Protection, Security Training</w:t>
+        <w:t>Physical Security: Armed Guards, Unarmed Guards, Event Security</w:t>
+      </w:r>
+    </w:p>
+    <w:p>
+      <w:pPr>
+        <w:pStyle w:val="ListBullet"/>
+      </w:pPr>
+      <w:r>
+        <w:t>Executive Protection, VIP &amp; Diplomatic Security</w:t>
+      </w:r>
+    </w:p>
+    <w:p>
+      <w:pPr>
+        <w:pStyle w:val="ListBullet"/>
+      </w:pPr>
+      <w:r>
+        <w:t>Security Training &amp; Certification</w:t>
+      </w:r>
+    </w:p>
+    <w:p>
+      <w:pPr>
+        <w:pStyle w:val="ListBullet"/>
+      </w:pPr>
+      <w:r>
+        <w:t>Cash-in-Transit &amp; High-Value Asset Protection</w:t>
       </w:r>
     </w:p>
     <w:p>
@@ -3807,15 +4213,15 @@
           <w:i w:val="0"/>
           <w:color w:val="0B1F3A"/>
         </w:rPr>
-        <w:t>Public Safety</w:t>
-      </w:r>
-    </w:p>
-    <w:p>
-      <w:pPr>
-        <w:pStyle w:val="ListBullet"/>
-      </w:pPr>
-      <w:r>
-        <w:t>Emergency Management</w:t>
+        <w:t>Public Safety &amp; Emergency Management</w:t>
+      </w:r>
+    </w:p>
+    <w:p>
+      <w:pPr>
+        <w:pStyle w:val="ListBullet"/>
+      </w:pPr>
+      <w:r>
+        <w:t>Emergency Management Planning &amp; Response</w:t>
       </w:r>
     </w:p>
     <w:p>
@@ -3831,7 +4237,15 @@
         <w:pStyle w:val="ListBullet"/>
       </w:pPr>
       <w:r>
-        <w:t>Disaster Response Coordination</w:t>
+        <w:t>Disaster Response Coordination &amp; Logistics</w:t>
+      </w:r>
+    </w:p>
+    <w:p>
+      <w:pPr>
+        <w:pStyle w:val="ListBullet"/>
+      </w:pPr>
+      <w:r>
+        <w:t>Search &amp; Rescue Operations Support</w:t>
       </w:r>
     </w:p>
     <w:p>
@@ -3841,39 +4255,39 @@
           <w:i w:val="0"/>
           <w:color w:val="0B1F3A"/>
         </w:rPr>
-        <w:t>Aerospace &amp; Defense Manufacturing (NEW)</w:t>
-      </w:r>
-    </w:p>
-    <w:p>
-      <w:pPr>
-        <w:pStyle w:val="ListBullet"/>
-      </w:pPr>
-      <w:r>
-        <w:t>UAV / Drones</w:t>
-      </w:r>
-    </w:p>
-    <w:p>
-      <w:pPr>
-        <w:pStyle w:val="ListBullet"/>
-      </w:pPr>
-      <w:r>
-        <w:t>Satellite Systems</w:t>
-      </w:r>
-    </w:p>
-    <w:p>
-      <w:pPr>
-        <w:pStyle w:val="ListBullet"/>
-      </w:pPr>
-      <w:r>
-        <w:t>Defense Electronics</w:t>
-      </w:r>
-    </w:p>
-    <w:p>
-      <w:pPr>
-        <w:pStyle w:val="ListBullet"/>
-      </w:pPr>
-      <w:r>
-        <w:t>Munitions &amp; Land Systems (regulated)</w:t>
+        <w:t>Aerospace &amp; Defense Manufacturing</w:t>
+      </w:r>
+    </w:p>
+    <w:p>
+      <w:pPr>
+        <w:pStyle w:val="ListBullet"/>
+      </w:pPr>
+      <w:r>
+        <w:t>UAV / Drones: ISR, Cargo, Combat (regulated)</w:t>
+      </w:r>
+    </w:p>
+    <w:p>
+      <w:pPr>
+        <w:pStyle w:val="ListBullet"/>
+      </w:pPr>
+      <w:r>
+        <w:t>Satellite Systems: LEO Constellations, Earth Observation</w:t>
+      </w:r>
+    </w:p>
+    <w:p>
+      <w:pPr>
+        <w:pStyle w:val="ListBullet"/>
+      </w:pPr>
+      <w:r>
+        <w:t>Defense Electronics &amp; Radar Systems</w:t>
+      </w:r>
+    </w:p>
+    <w:p>
+      <w:pPr>
+        <w:pStyle w:val="ListBullet"/>
+      </w:pPr>
+      <w:r>
+        <w:t>Armoured Vehicles &amp; Land Systems (regulated)</w:t>
       </w:r>
     </w:p>
     <w:p>
@@ -4074,23 +4488,39 @@
         <w:pStyle w:val="ListBullet"/>
       </w:pPr>
       <w:r>
-        <w:t>Construction Materials: Cement, Steel Reinforcement, Iron Rods, Building Products</w:t>
-      </w:r>
-    </w:p>
-    <w:p>
-      <w:pPr>
-        <w:pStyle w:val="ListBullet"/>
-      </w:pPr>
-      <w:r>
-        <w:t>Consumer Goods Manufacturing</w:t>
-      </w:r>
-    </w:p>
-    <w:p>
-      <w:pPr>
-        <w:pStyle w:val="ListBullet"/>
-      </w:pPr>
-      <w:r>
-        <w:t>Industrial Equipment Manufacturing (NEW)</w:t>
+        <w:t>Construction Materials: Cement, Steel, Iron Rods, Roofing, Tiles</w:t>
+      </w:r>
+    </w:p>
+    <w:p>
+      <w:pPr>
+        <w:pStyle w:val="ListBullet"/>
+      </w:pPr>
+      <w:r>
+        <w:t>Consumer Goods Manufacturing: Household, Personal Care</w:t>
+      </w:r>
+    </w:p>
+    <w:p>
+      <w:pPr>
+        <w:pStyle w:val="ListBullet"/>
+      </w:pPr>
+      <w:r>
+        <w:t>Industrial Equipment Manufacturing: Pumps, Compressors, Generators</w:t>
+      </w:r>
+    </w:p>
+    <w:p>
+      <w:pPr>
+        <w:pStyle w:val="ListBullet"/>
+      </w:pPr>
+      <w:r>
+        <w:t>3D Printing &amp; Additive Manufacturing</w:t>
+      </w:r>
+    </w:p>
+    <w:p>
+      <w:pPr>
+        <w:pStyle w:val="ListBullet"/>
+      </w:pPr>
+      <w:r>
+        <w:t>Packaging Manufacturing: Flexible, Rigid, Sustainable</w:t>
       </w:r>
     </w:p>
     <w:p>
@@ -4100,31 +4530,39 @@
           <w:i w:val="0"/>
           <w:color w:val="0B1F3A"/>
         </w:rPr>
-        <w:t>Industrial Processing</w:t>
-      </w:r>
-    </w:p>
-    <w:p>
-      <w:pPr>
-        <w:pStyle w:val="ListBullet"/>
-      </w:pPr>
-      <w:r>
-        <w:t>Material Processing</w:t>
-      </w:r>
-    </w:p>
-    <w:p>
-      <w:pPr>
-        <w:pStyle w:val="ListBullet"/>
-      </w:pPr>
-      <w:r>
-        <w:t>Fabrication</w:t>
-      </w:r>
-    </w:p>
-    <w:p>
-      <w:pPr>
-        <w:pStyle w:val="ListBullet"/>
-      </w:pPr>
-      <w:r>
-        <w:t>Chemicals &amp; Plastics (NEW)</w:t>
+        <w:t>Industrial Processing &amp; Chemicals</w:t>
+      </w:r>
+    </w:p>
+    <w:p>
+      <w:pPr>
+        <w:pStyle w:val="ListBullet"/>
+      </w:pPr>
+      <w:r>
+        <w:t>Material Processing: Steel Fabrication, Aluminium Rolling</w:t>
+      </w:r>
+    </w:p>
+    <w:p>
+      <w:pPr>
+        <w:pStyle w:val="ListBullet"/>
+      </w:pPr>
+      <w:r>
+        <w:t>Specialty Chemicals &amp; Plastics Manufacturing</w:t>
+      </w:r>
+    </w:p>
+    <w:p>
+      <w:pPr>
+        <w:pStyle w:val="ListBullet"/>
+      </w:pPr>
+      <w:r>
+        <w:t>Fertiliser Production &amp; Agrochemicals</w:t>
+      </w:r>
+    </w:p>
+    <w:p>
+      <w:pPr>
+        <w:pStyle w:val="ListBullet"/>
+      </w:pPr>
+      <w:r>
+        <w:t>Robotics Integration &amp; Smart Factory Automation</w:t>
       </w:r>
     </w:p>
     <w:p>
@@ -4134,31 +4572,47 @@
           <w:i w:val="0"/>
           <w:color w:val="0B1F3A"/>
         </w:rPr>
-        <w:t>Supply Chain</w:t>
-      </w:r>
-    </w:p>
-    <w:p>
-      <w:pPr>
-        <w:pStyle w:val="ListBullet"/>
-      </w:pPr>
-      <w:r>
-        <w:t>Logistics</w:t>
-      </w:r>
-    </w:p>
-    <w:p>
-      <w:pPr>
-        <w:pStyle w:val="ListBullet"/>
-      </w:pPr>
-      <w:r>
-        <w:t>Warehousing</w:t>
-      </w:r>
-    </w:p>
-    <w:p>
-      <w:pPr>
-        <w:pStyle w:val="ListBullet"/>
-      </w:pPr>
-      <w:r>
-        <w:t>Distribution</w:t>
+        <w:t>Supply Chain &amp; Logistics</w:t>
+      </w:r>
+    </w:p>
+    <w:p>
+      <w:pPr>
+        <w:pStyle w:val="ListBullet"/>
+      </w:pPr>
+      <w:r>
+        <w:t>Freight &amp; Intermodal Logistics</w:t>
+      </w:r>
+    </w:p>
+    <w:p>
+      <w:pPr>
+        <w:pStyle w:val="ListBullet"/>
+      </w:pPr>
+      <w:r>
+        <w:t>Warehousing: Distribution Centres, Bonded Stores</w:t>
+      </w:r>
+    </w:p>
+    <w:p>
+      <w:pPr>
+        <w:pStyle w:val="ListBullet"/>
+      </w:pPr>
+      <w:r>
+        <w:t>Inventory Management &amp; Demand Planning</w:t>
+      </w:r>
+    </w:p>
+    <w:p>
+      <w:pPr>
+        <w:pStyle w:val="ListBullet"/>
+      </w:pPr>
+      <w:r>
+        <w:t>Fleet Management &amp; Transport Operations</w:t>
+      </w:r>
+    </w:p>
+    <w:p>
+      <w:pPr>
+        <w:pStyle w:val="ListBullet"/>
+      </w:pPr>
+      <w:r>
+        <w:t>3PL &amp; 4PL Logistics Services</w:t>
       </w:r>
     </w:p>
     <w:p>
@@ -4168,31 +4622,39 @@
           <w:i w:val="0"/>
           <w:color w:val="0B1F3A"/>
         </w:rPr>
-        <w:t>Textiles &amp; Apparel (NEW)</w:t>
-      </w:r>
-    </w:p>
-    <w:p>
-      <w:pPr>
-        <w:pStyle w:val="ListBullet"/>
-      </w:pPr>
-      <w:r>
-        <w:t>Ginning, Spinning, Weaving</w:t>
-      </w:r>
-    </w:p>
-    <w:p>
-      <w:pPr>
-        <w:pStyle w:val="ListBullet"/>
-      </w:pPr>
-      <w:r>
-        <w:t>Garment Manufacturing</w:t>
-      </w:r>
-    </w:p>
-    <w:p>
-      <w:pPr>
-        <w:pStyle w:val="ListBullet"/>
-      </w:pPr>
-      <w:r>
-        <w:t>Branded Apparel</w:t>
+        <w:t>Textiles &amp; Apparel</w:t>
+      </w:r>
+    </w:p>
+    <w:p>
+      <w:pPr>
+        <w:pStyle w:val="ListBullet"/>
+      </w:pPr>
+      <w:r>
+        <w:t>Cotton Ginning, Spinning &amp; Weaving</w:t>
+      </w:r>
+    </w:p>
+    <w:p>
+      <w:pPr>
+        <w:pStyle w:val="ListBullet"/>
+      </w:pPr>
+      <w:r>
+        <w:t>Garment Manufacturing &amp; CMT (Cut, Make, Trim)</w:t>
+      </w:r>
+    </w:p>
+    <w:p>
+      <w:pPr>
+        <w:pStyle w:val="ListBullet"/>
+      </w:pPr>
+      <w:r>
+        <w:t>Branded Apparel &amp; Retail Fashion Labels</w:t>
+      </w:r>
+    </w:p>
+    <w:p>
+      <w:pPr>
+        <w:pStyle w:val="ListBullet"/>
+      </w:pPr>
+      <w:r>
+        <w:t>Technical Textiles: Protective, Industrial, Medical</w:t>
       </w:r>
     </w:p>
     <w:p>
@@ -4340,7 +4802,7 @@
           <w:i/>
           <w:color w:val="555555"/>
         </w:rPr>
-        <w:t>Management consulting, project management, organisational development, outsourcing and professional services.</w:t>
+        <w:t>Management consulting, project management, outsourcing, legal, accounting and professional services.</w:t>
       </w:r>
     </w:p>
     <w:p>
@@ -4385,31 +4847,47 @@
           <w:i w:val="0"/>
           <w:color w:val="0B1F3A"/>
         </w:rPr>
-        <w:t>Management Consulting</w:t>
-      </w:r>
-    </w:p>
-    <w:p>
-      <w:pPr>
-        <w:pStyle w:val="ListBullet"/>
-      </w:pPr>
-      <w:r>
-        <w:t>Strategy Consulting</w:t>
-      </w:r>
-    </w:p>
-    <w:p>
-      <w:pPr>
-        <w:pStyle w:val="ListBullet"/>
-      </w:pPr>
-      <w:r>
-        <w:t>Business Transformation</w:t>
-      </w:r>
-    </w:p>
-    <w:p>
-      <w:pPr>
-        <w:pStyle w:val="ListBullet"/>
-      </w:pPr>
-      <w:r>
-        <w:t>Governance, Risk &amp; Compliance Advisory: Enterprise Risk Management, Internal Controls, Compliance Programs, Audit Readiness</w:t>
+        <w:t>Strategy, Consulting &amp; PMO</w:t>
+      </w:r>
+    </w:p>
+    <w:p>
+      <w:pPr>
+        <w:pStyle w:val="ListBullet"/>
+      </w:pPr>
+      <w:r>
+        <w:t>Strategy Consulting: Corporate Strategy, Market Entry, Competitive Intelligence</w:t>
+      </w:r>
+    </w:p>
+    <w:p>
+      <w:pPr>
+        <w:pStyle w:val="ListBullet"/>
+      </w:pPr>
+      <w:r>
+        <w:t>Business Transformation &amp; Change Management</w:t>
+      </w:r>
+    </w:p>
+    <w:p>
+      <w:pPr>
+        <w:pStyle w:val="ListBullet"/>
+      </w:pPr>
+      <w:r>
+        <w:t>PMO Services: Program Management, Portfolio Management</w:t>
+      </w:r>
+    </w:p>
+    <w:p>
+      <w:pPr>
+        <w:pStyle w:val="ListBullet"/>
+      </w:pPr>
+      <w:r>
+        <w:t>Governance, Risk &amp; Compliance Advisory: ERM, Internal Controls, Audit Readiness</w:t>
+      </w:r>
+    </w:p>
+    <w:p>
+      <w:pPr>
+        <w:pStyle w:val="ListBullet"/>
+      </w:pPr>
+      <w:r>
+        <w:t>Organisational Development &amp; HR Consulting</w:t>
       </w:r>
     </w:p>
     <w:p>
@@ -4419,23 +4897,47 @@
           <w:i w:val="0"/>
           <w:color w:val="0B1F3A"/>
         </w:rPr>
-        <w:t>Project Management</w:t>
-      </w:r>
-    </w:p>
-    <w:p>
-      <w:pPr>
-        <w:pStyle w:val="ListBullet"/>
-      </w:pPr>
-      <w:r>
-        <w:t>PMO Services</w:t>
-      </w:r>
-    </w:p>
-    <w:p>
-      <w:pPr>
-        <w:pStyle w:val="ListBullet"/>
-      </w:pPr>
-      <w:r>
-        <w:t>Program Management</w:t>
+        <w:t>Business Outsourcing &amp; BPO</w:t>
+      </w:r>
+    </w:p>
+    <w:p>
+      <w:pPr>
+        <w:pStyle w:val="ListBullet"/>
+      </w:pPr>
+      <w:r>
+        <w:t>Administrative Services &amp; Secretarial Support</w:t>
+      </w:r>
+    </w:p>
+    <w:p>
+      <w:pPr>
+        <w:pStyle w:val="ListBullet"/>
+      </w:pPr>
+      <w:r>
+        <w:t>Back Office Operations: Finance, HR, Procurement</w:t>
+      </w:r>
+    </w:p>
+    <w:p>
+      <w:pPr>
+        <w:pStyle w:val="ListBullet"/>
+      </w:pPr>
+      <w:r>
+        <w:t>Customer Contact Centres: Multilingual, Omnichannel</w:t>
+      </w:r>
+    </w:p>
+    <w:p>
+      <w:pPr>
+        <w:pStyle w:val="ListBullet"/>
+      </w:pPr>
+      <w:r>
+        <w:t>Knowledge Process Outsourcing (KPO)</w:t>
+      </w:r>
+    </w:p>
+    <w:p>
+      <w:pPr>
+        <w:pStyle w:val="ListBullet"/>
+      </w:pPr>
+      <w:r>
+        <w:t>Robotic Process Automation as a Service</w:t>
       </w:r>
     </w:p>
     <w:p>
@@ -4445,23 +4947,47 @@
           <w:i w:val="0"/>
           <w:color w:val="0B1F3A"/>
         </w:rPr>
-        <w:t>Organizational Development</w:t>
-      </w:r>
-    </w:p>
-    <w:p>
-      <w:pPr>
-        <w:pStyle w:val="ListBullet"/>
-      </w:pPr>
-      <w:r>
-        <w:t>HR Consulting</w:t>
-      </w:r>
-    </w:p>
-    <w:p>
-      <w:pPr>
-        <w:pStyle w:val="ListBullet"/>
-      </w:pPr>
-      <w:r>
-        <w:t>Change Management</w:t>
+        <w:t>Legal Services</w:t>
+      </w:r>
+    </w:p>
+    <w:p>
+      <w:pPr>
+        <w:pStyle w:val="ListBullet"/>
+      </w:pPr>
+      <w:r>
+        <w:t>Corporate Law: M&amp;A, Joint Ventures, Commercial Contracts</w:t>
+      </w:r>
+    </w:p>
+    <w:p>
+      <w:pPr>
+        <w:pStyle w:val="ListBullet"/>
+      </w:pPr>
+      <w:r>
+        <w:t>Intellectual Property: Patents, Trademarks, Licensing</w:t>
+      </w:r>
+    </w:p>
+    <w:p>
+      <w:pPr>
+        <w:pStyle w:val="ListBullet"/>
+      </w:pPr>
+      <w:r>
+        <w:t>Regulatory &amp; Compliance Counsel</w:t>
+      </w:r>
+    </w:p>
+    <w:p>
+      <w:pPr>
+        <w:pStyle w:val="ListBullet"/>
+      </w:pPr>
+      <w:r>
+        <w:t>Cross-Border Transaction Counsel &amp; Arbitration</w:t>
+      </w:r>
+    </w:p>
+    <w:p>
+      <w:pPr>
+        <w:pStyle w:val="ListBullet"/>
+      </w:pPr>
+      <w:r>
+        <w:t>Employment &amp; Labour Law</w:t>
       </w:r>
     </w:p>
     <w:p>
@@ -4471,115 +4997,47 @@
           <w:i w:val="0"/>
           <w:color w:val="0B1F3A"/>
         </w:rPr>
-        <w:t>Business Outsourcing</w:t>
-      </w:r>
-    </w:p>
-    <w:p>
-      <w:pPr>
-        <w:pStyle w:val="ListBullet"/>
-      </w:pPr>
-      <w:r>
-        <w:t>Administrative Services</w:t>
-      </w:r>
-    </w:p>
-    <w:p>
-      <w:pPr>
-        <w:pStyle w:val="ListBullet"/>
-      </w:pPr>
-      <w:r>
-        <w:t>Back Office Operations</w:t>
-      </w:r>
-    </w:p>
-    <w:p>
-      <w:pPr>
-        <w:pStyle w:val="ListBullet"/>
-      </w:pPr>
-      <w:r>
-        <w:t>Customer Contact Centers (NEW)</w:t>
-      </w:r>
-    </w:p>
-    <w:p>
-      <w:r>
-        <w:rPr>
-          <w:b/>
-          <w:i w:val="0"/>
-          <w:color w:val="0B1F3A"/>
-        </w:rPr>
-        <w:t>Legal Services (NEW)</w:t>
-      </w:r>
-    </w:p>
-    <w:p>
-      <w:pPr>
-        <w:pStyle w:val="ListBullet"/>
-      </w:pPr>
-      <w:r>
-        <w:t>Corporate Law</w:t>
-      </w:r>
-    </w:p>
-    <w:p>
-      <w:pPr>
-        <w:pStyle w:val="ListBullet"/>
-      </w:pPr>
-      <w:r>
-        <w:t>Intellectual Property</w:t>
-      </w:r>
-    </w:p>
-    <w:p>
-      <w:pPr>
-        <w:pStyle w:val="ListBullet"/>
-      </w:pPr>
-      <w:r>
-        <w:t>Regulatory &amp; Compliance Counsel</w:t>
-      </w:r>
-    </w:p>
-    <w:p>
-      <w:pPr>
-        <w:pStyle w:val="ListBullet"/>
-      </w:pPr>
-      <w:r>
-        <w:t>Cross-Border Transaction Counsel</w:t>
-      </w:r>
-    </w:p>
-    <w:p>
-      <w:r>
-        <w:rPr>
-          <w:b/>
-          <w:i w:val="0"/>
-          <w:color w:val="0B1F3A"/>
-        </w:rPr>
-        <w:t>Accounting, Tax &amp; Audit (NEW)</w:t>
-      </w:r>
-    </w:p>
-    <w:p>
-      <w:pPr>
-        <w:pStyle w:val="ListBullet"/>
-      </w:pPr>
-      <w:r>
-        <w:t>Tax Advisory</w:t>
-      </w:r>
-    </w:p>
-    <w:p>
-      <w:pPr>
-        <w:pStyle w:val="ListBullet"/>
-      </w:pPr>
-      <w:r>
-        <w:t>External Audit</w:t>
-      </w:r>
-    </w:p>
-    <w:p>
-      <w:pPr>
-        <w:pStyle w:val="ListBullet"/>
-      </w:pPr>
-      <w:r>
-        <w:t>Forensic Accounting</w:t>
-      </w:r>
-    </w:p>
-    <w:p>
-      <w:pPr>
-        <w:pStyle w:val="ListBullet"/>
-      </w:pPr>
-      <w:r>
-        <w:t>Transfer Pricing</w:t>
+        <w:t>Accounting, Tax &amp; Audit</w:t>
+      </w:r>
+    </w:p>
+    <w:p>
+      <w:pPr>
+        <w:pStyle w:val="ListBullet"/>
+      </w:pPr>
+      <w:r>
+        <w:t>Tax Advisory: International Tax, Transfer Pricing, VAT</w:t>
+      </w:r>
+    </w:p>
+    <w:p>
+      <w:pPr>
+        <w:pStyle w:val="ListBullet"/>
+      </w:pPr>
+      <w:r>
+        <w:t>External Audit &amp; Assurance</w:t>
+      </w:r>
+    </w:p>
+    <w:p>
+      <w:pPr>
+        <w:pStyle w:val="ListBullet"/>
+      </w:pPr>
+      <w:r>
+        <w:t>Forensic Accounting &amp; Anti-Fraud Investigation</w:t>
+      </w:r>
+    </w:p>
+    <w:p>
+      <w:pPr>
+        <w:pStyle w:val="ListBullet"/>
+      </w:pPr>
+      <w:r>
+        <w:t>Financial Reporting: IFRS, US GAAP Conversion</w:t>
+      </w:r>
+    </w:p>
+    <w:p>
+      <w:pPr>
+        <w:pStyle w:val="ListBullet"/>
+      </w:pPr>
+      <w:r>
+        <w:t>Internal Audit Co-sourcing &amp; Outsourcing</w:t>
       </w:r>
     </w:p>
     <w:p>
@@ -4780,23 +5238,31 @@
         <w:pStyle w:val="ListBullet"/>
       </w:pPr>
       <w:r>
-        <w:t>Economic Development</w:t>
-      </w:r>
-    </w:p>
-    <w:p>
-      <w:pPr>
-        <w:pStyle w:val="ListBullet"/>
-      </w:pPr>
-      <w:r>
-        <w:t>Institutional Strengthening</w:t>
-      </w:r>
-    </w:p>
-    <w:p>
-      <w:pPr>
-        <w:pStyle w:val="ListBullet"/>
-      </w:pPr>
-      <w:r>
-        <w:t>Donor-Funded Programs: USAID, UN, World Bank, African Development Bank, Capacity Building</w:t>
+        <w:t>Economic Development: Private Sector Development, Value Chain Strengthening</w:t>
+      </w:r>
+    </w:p>
+    <w:p>
+      <w:pPr>
+        <w:pStyle w:val="ListBullet"/>
+      </w:pPr>
+      <w:r>
+        <w:t>Institutional Strengthening: Capacity Building, Governance Reform</w:t>
+      </w:r>
+    </w:p>
+    <w:p>
+      <w:pPr>
+        <w:pStyle w:val="ListBullet"/>
+      </w:pPr>
+      <w:r>
+        <w:t>Donor-Funded Programs: USAID, UN, World Bank, African Development Bank</w:t>
+      </w:r>
+    </w:p>
+    <w:p>
+      <w:pPr>
+        <w:pStyle w:val="ListBullet"/>
+      </w:pPr>
+      <w:r>
+        <w:t>Climate Adaptation &amp; Resilience Programs</w:t>
       </w:r>
     </w:p>
     <w:p>
@@ -4806,23 +5272,39 @@
           <w:i w:val="0"/>
           <w:color w:val="0B1F3A"/>
         </w:rPr>
-        <w:t>Community Development</w:t>
-      </w:r>
-    </w:p>
-    <w:p>
-      <w:pPr>
-        <w:pStyle w:val="ListBullet"/>
-      </w:pPr>
-      <w:r>
-        <w:t>Youth Programs</w:t>
-      </w:r>
-    </w:p>
-    <w:p>
-      <w:pPr>
-        <w:pStyle w:val="ListBullet"/>
-      </w:pPr>
-      <w:r>
-        <w:t>Women Empowerment</w:t>
+        <w:t>Community, Foundation &amp; Grants</w:t>
+      </w:r>
+    </w:p>
+    <w:p>
+      <w:pPr>
+        <w:pStyle w:val="ListBullet"/>
+      </w:pPr>
+      <w:r>
+        <w:t>Youth Programs: Mentorship, Leadership, Skills Development</w:t>
+      </w:r>
+    </w:p>
+    <w:p>
+      <w:pPr>
+        <w:pStyle w:val="ListBullet"/>
+      </w:pPr>
+      <w:r>
+        <w:t>Women Empowerment: Economic Inclusion, STEM for Girls</w:t>
+      </w:r>
+    </w:p>
+    <w:p>
+      <w:pPr>
+        <w:pStyle w:val="ListBullet"/>
+      </w:pPr>
+      <w:r>
+        <w:t>Scholarships, Grants &amp; Charitable Giving</w:t>
+      </w:r>
+    </w:p>
+    <w:p>
+      <w:pPr>
+        <w:pStyle w:val="ListBullet"/>
+      </w:pPr>
+      <w:r>
+        <w:t>Community Infrastructure: Schools, Clinics, Water Points</w:t>
       </w:r>
     </w:p>
     <w:p>
@@ -4832,31 +5314,39 @@
           <w:i w:val="0"/>
           <w:color w:val="0B1F3A"/>
         </w:rPr>
-        <w:t>Foundation Programs</w:t>
-      </w:r>
-    </w:p>
-    <w:p>
-      <w:pPr>
-        <w:pStyle w:val="ListBullet"/>
-      </w:pPr>
-      <w:r>
-        <w:t>Scholarships</w:t>
-      </w:r>
-    </w:p>
-    <w:p>
-      <w:pPr>
-        <w:pStyle w:val="ListBullet"/>
-      </w:pPr>
-      <w:r>
-        <w:t>Grants</w:t>
-      </w:r>
-    </w:p>
-    <w:p>
-      <w:pPr>
-        <w:pStyle w:val="ListBullet"/>
-      </w:pPr>
-      <w:r>
-        <w:t>Charitable Giving</w:t>
+        <w:t>Research, Policy &amp; Evaluation</w:t>
+      </w:r>
+    </w:p>
+    <w:p>
+      <w:pPr>
+        <w:pStyle w:val="ListBullet"/>
+      </w:pPr>
+      <w:r>
+        <w:t>Policy Research &amp; Advocacy</w:t>
+      </w:r>
+    </w:p>
+    <w:p>
+      <w:pPr>
+        <w:pStyle w:val="ListBullet"/>
+      </w:pPr>
+      <w:r>
+        <w:t>Monitoring &amp; Evaluation (M&amp;E): Impact Measurement, Logframes</w:t>
+      </w:r>
+    </w:p>
+    <w:p>
+      <w:pPr>
+        <w:pStyle w:val="ListBullet"/>
+      </w:pPr>
+      <w:r>
+        <w:t>Development Data &amp; GIS Mapping</w:t>
+      </w:r>
+    </w:p>
+    <w:p>
+      <w:pPr>
+        <w:pStyle w:val="ListBullet"/>
+      </w:pPr>
+      <w:r>
+        <w:t>Think Tank &amp; Knowledge Publications</w:t>
       </w:r>
     </w:p>
     <w:p>
@@ -4866,41 +5356,15 @@
           <w:i w:val="0"/>
           <w:color w:val="0B1F3A"/>
         </w:rPr>
-        <w:t>Research &amp; Policy</w:t>
-      </w:r>
-    </w:p>
-    <w:p>
-      <w:pPr>
-        <w:pStyle w:val="ListBullet"/>
-      </w:pPr>
-      <w:r>
-        <w:t>Policy Research</w:t>
-      </w:r>
-    </w:p>
-    <w:p>
-      <w:pPr>
-        <w:pStyle w:val="ListBullet"/>
-      </w:pPr>
-      <w:r>
-        <w:t>Monitoring &amp; Evaluation</w:t>
-      </w:r>
-    </w:p>
-    <w:p>
-      <w:r>
-        <w:rPr>
-          <w:b/>
-          <w:i w:val="0"/>
-          <w:color w:val="0B1F3A"/>
-        </w:rPr>
-        <w:t>Humanitarian &amp; Disaster Response (NEW)</w:t>
-      </w:r>
-    </w:p>
-    <w:p>
-      <w:pPr>
-        <w:pStyle w:val="ListBullet"/>
-      </w:pPr>
-      <w:r>
-        <w:t>Emergency Relief</w:t>
+        <w:t>Humanitarian &amp; Disaster Response</w:t>
+      </w:r>
+    </w:p>
+    <w:p>
+      <w:pPr>
+        <w:pStyle w:val="ListBullet"/>
+      </w:pPr>
+      <w:r>
+        <w:t>Emergency Relief: Food, Water, Shelter, Non-Food Items</w:t>
       </w:r>
     </w:p>
     <w:p>
@@ -4916,7 +5380,15 @@
         <w:pStyle w:val="ListBullet"/>
       </w:pPr>
       <w:r>
-        <w:t>Resilience Programs</w:t>
+        <w:t>Resilience Programs: Livelihood Recovery, DRR</w:t>
+      </w:r>
+    </w:p>
+    <w:p>
+      <w:pPr>
+        <w:pStyle w:val="ListBullet"/>
+      </w:pPr>
+      <w:r>
+        <w:t>Health Emergency Response</w:t>
       </w:r>
     </w:p>
     <w:p>
@@ -5117,23 +5589,31 @@
         <w:pStyle w:val="ListBullet"/>
       </w:pPr>
       <w:r>
-        <w:t>Football Academy</w:t>
-      </w:r>
-    </w:p>
-    <w:p>
-      <w:pPr>
-        <w:pStyle w:val="ListBullet"/>
-      </w:pPr>
-      <w:r>
-        <w:t>Basketball Academy</w:t>
-      </w:r>
-    </w:p>
-    <w:p>
-      <w:pPr>
-        <w:pStyle w:val="ListBullet"/>
-      </w:pPr>
-      <w:r>
-        <w:t>Athletics Academy</w:t>
+        <w:t>Football Academy: Grassroots, Elite, Scout Networks</w:t>
+      </w:r>
+    </w:p>
+    <w:p>
+      <w:pPr>
+        <w:pStyle w:val="ListBullet"/>
+      </w:pPr>
+      <w:r>
+        <w:t>Basketball &amp; Athletics Academies</w:t>
+      </w:r>
+    </w:p>
+    <w:p>
+      <w:pPr>
+        <w:pStyle w:val="ListBullet"/>
+      </w:pPr>
+      <w:r>
+        <w:t>Swimming &amp; Aquatic Sports Centers</w:t>
+      </w:r>
+    </w:p>
+    <w:p>
+      <w:pPr>
+        <w:pStyle w:val="ListBullet"/>
+      </w:pPr>
+      <w:r>
+        <w:t>Multi-Sport Elite Performance Centres</w:t>
       </w:r>
     </w:p>
     <w:p>
@@ -5143,23 +5623,39 @@
           <w:i w:val="0"/>
           <w:color w:val="0B1F3A"/>
         </w:rPr>
-        <w:t>Recreation</w:t>
-      </w:r>
-    </w:p>
-    <w:p>
-      <w:pPr>
-        <w:pStyle w:val="ListBullet"/>
-      </w:pPr>
-      <w:r>
-        <w:t>Recreation Centers</w:t>
-      </w:r>
-    </w:p>
-    <w:p>
-      <w:pPr>
-        <w:pStyle w:val="ListBullet"/>
-      </w:pPr>
-      <w:r>
-        <w:t>Community Sports Programs</w:t>
+        <w:t>Recreation &amp; Community Sports</w:t>
+      </w:r>
+    </w:p>
+    <w:p>
+      <w:pPr>
+        <w:pStyle w:val="ListBullet"/>
+      </w:pPr>
+      <w:r>
+        <w:t>Recreation Centers: Gyms, Courts, Tracks</w:t>
+      </w:r>
+    </w:p>
+    <w:p>
+      <w:pPr>
+        <w:pStyle w:val="ListBullet"/>
+      </w:pPr>
+      <w:r>
+        <w:t>Community Sports Programs &amp; School Partnerships</w:t>
+      </w:r>
+    </w:p>
+    <w:p>
+      <w:pPr>
+        <w:pStyle w:val="ListBullet"/>
+      </w:pPr>
+      <w:r>
+        <w:t>Sports Tourism: Sports Camps, Training Retreats</w:t>
+      </w:r>
+    </w:p>
+    <w:p>
+      <w:pPr>
+        <w:pStyle w:val="ListBullet"/>
+      </w:pPr>
+      <w:r>
+        <w:t>Sports Nutrition &amp; Performance Science Clinics</w:t>
       </w:r>
     </w:p>
     <w:p>
@@ -5177,23 +5673,31 @@
         <w:pStyle w:val="ListBullet"/>
       </w:pPr>
       <w:r>
-        <w:t>Leadership Programs</w:t>
-      </w:r>
-    </w:p>
-    <w:p>
-      <w:pPr>
-        <w:pStyle w:val="ListBullet"/>
-      </w:pPr>
-      <w:r>
-        <w:t>Mentorship Programs</w:t>
-      </w:r>
-    </w:p>
-    <w:p>
-      <w:pPr>
-        <w:pStyle w:val="ListBullet"/>
-      </w:pPr>
-      <w:r>
-        <w:t>Youth Entrepreneurship: Startup Incubation, Business Training, Innovation Challenges, Youth Employment</w:t>
+        <w:t>Leadership Programs: Youth Councils, Governance Training</w:t>
+      </w:r>
+    </w:p>
+    <w:p>
+      <w:pPr>
+        <w:pStyle w:val="ListBullet"/>
+      </w:pPr>
+      <w:r>
+        <w:t>Mentorship Programs: Industry Connect, Alumni Networks</w:t>
+      </w:r>
+    </w:p>
+    <w:p>
+      <w:pPr>
+        <w:pStyle w:val="ListBullet"/>
+      </w:pPr>
+      <w:r>
+        <w:t>Youth Entrepreneurship: Startup Incubation, Business Training</w:t>
+      </w:r>
+    </w:p>
+    <w:p>
+      <w:pPr>
+        <w:pStyle w:val="ListBullet"/>
+      </w:pPr>
+      <w:r>
+        <w:t>Innovation Challenges &amp; Youth Employment Programs</w:t>
       </w:r>
     </w:p>
     <w:p>
@@ -5203,31 +5707,39 @@
           <w:i w:val="0"/>
           <w:color w:val="0B1F3A"/>
         </w:rPr>
-        <w:t>Sports Management</w:t>
-      </w:r>
-    </w:p>
-    <w:p>
-      <w:pPr>
-        <w:pStyle w:val="ListBullet"/>
-      </w:pPr>
-      <w:r>
-        <w:t>Event Management</w:t>
-      </w:r>
-    </w:p>
-    <w:p>
-      <w:pPr>
-        <w:pStyle w:val="ListBullet"/>
-      </w:pPr>
-      <w:r>
-        <w:t>Talent Management</w:t>
-      </w:r>
-    </w:p>
-    <w:p>
-      <w:pPr>
-        <w:pStyle w:val="ListBullet"/>
-      </w:pPr>
-      <w:r>
-        <w:t>Facility Management</w:t>
+        <w:t>Sports Management &amp; Technology</w:t>
+      </w:r>
+    </w:p>
+    <w:p>
+      <w:pPr>
+        <w:pStyle w:val="ListBullet"/>
+      </w:pPr>
+      <w:r>
+        <w:t>Event Management: Tournaments, Leagues, International Events</w:t>
+      </w:r>
+    </w:p>
+    <w:p>
+      <w:pPr>
+        <w:pStyle w:val="ListBullet"/>
+      </w:pPr>
+      <w:r>
+        <w:t>Talent Management: Athlete Representation, Sponsorship Deals</w:t>
+      </w:r>
+    </w:p>
+    <w:p>
+      <w:pPr>
+        <w:pStyle w:val="ListBullet"/>
+      </w:pPr>
+      <w:r>
+        <w:t>Facility Management: Stadium Operations, Ground Maintenance</w:t>
+      </w:r>
+    </w:p>
+    <w:p>
+      <w:pPr>
+        <w:pStyle w:val="ListBullet"/>
+      </w:pPr>
+      <w:r>
+        <w:t>Fan Engagement &amp; Sports Tech: App Platforms, Ticketing, Analytics</w:t>
       </w:r>
     </w:p>
     <w:p>
@@ -5237,31 +5749,39 @@
           <w:i w:val="0"/>
           <w:color w:val="0B1F3A"/>
         </w:rPr>
-        <w:t>eSports &amp; Gaming (NEW)</w:t>
-      </w:r>
-    </w:p>
-    <w:p>
-      <w:pPr>
-        <w:pStyle w:val="ListBullet"/>
-      </w:pPr>
-      <w:r>
-        <w:t>Pro Teams &amp; Leagues</w:t>
-      </w:r>
-    </w:p>
-    <w:p>
-      <w:pPr>
-        <w:pStyle w:val="ListBullet"/>
-      </w:pPr>
-      <w:r>
-        <w:t>Gaming Arenas</w:t>
-      </w:r>
-    </w:p>
-    <w:p>
-      <w:pPr>
-        <w:pStyle w:val="ListBullet"/>
-      </w:pPr>
-      <w:r>
-        <w:t>Tournaments &amp; Events</w:t>
+        <w:t>eSports &amp; Gaming</w:t>
+      </w:r>
+    </w:p>
+    <w:p>
+      <w:pPr>
+        <w:pStyle w:val="ListBullet"/>
+      </w:pPr>
+      <w:r>
+        <w:t>Pro Teams &amp; Competitive Leagues</w:t>
+      </w:r>
+    </w:p>
+    <w:p>
+      <w:pPr>
+        <w:pStyle w:val="ListBullet"/>
+      </w:pPr>
+      <w:r>
+        <w:t>Gaming Arenas &amp; LAN Centers</w:t>
+      </w:r>
+    </w:p>
+    <w:p>
+      <w:pPr>
+        <w:pStyle w:val="ListBullet"/>
+      </w:pPr>
+      <w:r>
+        <w:t>Tournaments, Events &amp; Broadcasting Rights</w:t>
+      </w:r>
+    </w:p>
+    <w:p>
+      <w:pPr>
+        <w:pStyle w:val="ListBullet"/>
+      </w:pPr>
+      <w:r>
+        <w:t>Game Development &amp; Gaming IP</w:t>
       </w:r>
     </w:p>
     <w:p>

</xml_diff>